<commit_message>
Lecture 5, case study work.
</commit_message>
<xml_diff>
--- a/docs/cases/01-dax-cowart.docx
+++ b/docs/cases/01-dax-cowart.docx
@@ -31,7 +31,7 @@
         <w:pStyle w:val="Date"/>
       </w:pPr>
       <w:r>
-        <w:t xml:space="preserve">2026-05-19</w:t>
+        <w:t xml:space="preserve">2026-05-21</w:t>
       </w:r>
     </w:p>
     <w:sdt>
@@ -1948,14 +1948,13 @@
     </w:p>
     <w:p>
       <w:pPr>
-        <w:pStyle w:val="Compact"/>
         <w:numPr>
           <w:ilvl w:val="0"/>
           <w:numId w:val="1006"/>
         </w:numPr>
       </w:pPr>
       <w:r>
-        <w:t xml:space="preserve">Reconstruct</w:t>
+        <w:t xml:space="preserve">Write out</w:t>
       </w:r>
       <w:r>
         <w:t xml:space="preserve"> </w:t>
@@ -1981,41 +1980,40 @@
           <w:b/>
           <w:bCs/>
         </w:rPr>
-        <w:t xml:space="preserve">The Beneficence / Temporary-Incapacity Reply</w:t>
-      </w:r>
-      <w:r>
-        <w:t xml:space="preserve"> </w:t>
-      </w:r>
-      <w:r>
-        <w:t xml:space="preserve">in your own words. They share no disputed premise except one — identify it, and say what kind of evidence (clinical, philosophical, statistical) could actually settle it.</w:t>
-      </w:r>
-    </w:p>
-    <w:p>
-      <w:pPr>
-        <w:pStyle w:val="Compact"/>
+        <w:t xml:space="preserve">The Beneficence Reply</w:t>
+      </w:r>
+      <w:r>
+        <w:t xml:space="preserve"> </w:t>
+      </w:r>
+      <w:r>
+        <w:t xml:space="preserve">in your own words — premises first, then the conclusion. The two arguments disagree about one thing: whether Cowart was</w:t>
+      </w:r>
+      <w:r>
+        <w:t xml:space="preserve"> </w:t>
+      </w:r>
+      <w:r>
+        <w:rPr>
+          <w:i/>
+          <w:iCs/>
+        </w:rPr>
+        <w:t xml:space="preserve">competent</w:t>
+      </w:r>
+      <w:r>
+        <w:t xml:space="preserve"> </w:t>
+      </w:r>
+      <w:r>
+        <w:t xml:space="preserve">to refuse during his treatment. Then say what kind of evidence — clinical, philosophical, or statistical — could actually settle that question.</w:t>
+      </w:r>
+    </w:p>
+    <w:p>
+      <w:pPr>
         <w:numPr>
           <w:ilvl w:val="0"/>
           <w:numId w:val="1006"/>
         </w:numPr>
       </w:pPr>
       <w:r>
-        <w:t xml:space="preserve">Cowart said he was glad to be alive</w:t>
-      </w:r>
-      <w:r>
-        <w:t xml:space="preserve"> </w:t>
-      </w:r>
-      <w:r>
-        <w:rPr>
-          <w:i/>
-          <w:iCs/>
-        </w:rPr>
-        <w:t xml:space="preserve">and</w:t>
-      </w:r>
-      <w:r>
-        <w:t xml:space="preserve"> </w:t>
-      </w:r>
-      <w:r>
-        <w:t xml:space="preserve">that his rights had been violated. Using the idea of</w:t>
+        <w:t xml:space="preserve">After he recovered, Cowart said two things: he was glad to be alive, and his rights had been violated. The idea of</w:t>
       </w:r>
       <w:r>
         <w:t xml:space="preserve"> </w:t>
@@ -2028,84 +2026,64 @@
         <w:t xml:space="preserve">moral residue</w:t>
       </w:r>
       <w:r>
-        <w:t xml:space="preserve">, explain why this is not a contradiction — and say what it implies for how we should judge paternalistic decisions that</w:t>
-      </w:r>
-      <w:r>
-        <w:t xml:space="preserve"> </w:t>
-      </w:r>
-      <w:r>
-        <w:t xml:space="preserve">“turned out fine.”</w:t>
-      </w:r>
-    </w:p>
-    <w:p>
-      <w:pPr>
-        <w:pStyle w:val="Compact"/>
+        <w:t xml:space="preserve"> </w:t>
+      </w:r>
+      <w:r>
+        <w:t xml:space="preserve">says a decision can turn out fine and still leave a moral debt behind. Use that idea to explain why his two statements are not a contradiction. What does the idea tell us about paternalistic decisions that</w:t>
+      </w:r>
+      <w:r>
+        <w:t xml:space="preserve"> </w:t>
+      </w:r>
+      <w:r>
+        <w:t xml:space="preserve">“turned out fine”</w:t>
+      </w:r>
+      <w:r>
+        <w:t xml:space="preserve">?</w:t>
+      </w:r>
+    </w:p>
+    <w:p>
+      <w:pPr>
         <w:numPr>
           <w:ilvl w:val="0"/>
           <w:numId w:val="1006"/>
         </w:numPr>
       </w:pPr>
       <w:r>
-        <w:t xml:space="preserve">The Beneficence Reply uses a statistical generalization (</w:t>
-      </w:r>
-      <w:r>
-        <w:t xml:space="preserve">“most such patients are later glad”</w:t>
-      </w:r>
-      <w:r>
-        <w:t xml:space="preserve">) to override one individual. When, if ever, is it legitimate to apply a true generalization about a group to the particular person in front of you? What principle are you relying on?</w:t>
-      </w:r>
-    </w:p>
-    <w:p>
-      <w:pPr>
-        <w:pStyle w:val="Compact"/>
+        <w:t xml:space="preserve">The Beneficence Reply uses a generalization about a group —</w:t>
+      </w:r>
+      <w:r>
+        <w:t xml:space="preserve"> </w:t>
+      </w:r>
+      <w:r>
+        <w:t xml:space="preserve">“most patients in Cowart’s situation are later glad they were treated”</w:t>
+      </w:r>
+      <w:r>
+        <w:t xml:space="preserve"> </w:t>
+      </w:r>
+      <w:r>
+        <w:t xml:space="preserve">— to override one person’s choice. When, if ever, is it fair to apply a true generalization about a group to the specific person in front of you? What principle are you relying on?</w:t>
+      </w:r>
+    </w:p>
+    <w:p>
+      <w:pPr>
         <w:numPr>
           <w:ilvl w:val="0"/>
           <w:numId w:val="1006"/>
         </w:numPr>
       </w:pPr>
       <w:r>
-        <w:t xml:space="preserve">You are the nurse assigned to Cowart’s daily tank treatment. He has just told you, again, that he wants it to stop and wants to die. Drawing on the</w:t>
-      </w:r>
-      <w:r>
-        <w:t xml:space="preserve"> </w:t>
-      </w:r>
-      <w:r>
-        <w:rPr>
-          <w:b/>
-          <w:bCs/>
-        </w:rPr>
-        <w:t xml:space="preserve">virtues of a good nurse</w:t>
-      </w:r>
-      <w:r>
-        <w:t xml:space="preserve"> </w:t>
-      </w:r>
-      <w:r>
-        <w:t xml:space="preserve">and</w:t>
-      </w:r>
-      <w:r>
-        <w:t xml:space="preserve"> </w:t>
-      </w:r>
-      <w:r>
-        <w:rPr>
-          <w:b/>
-          <w:bCs/>
-        </w:rPr>
-        <w:t xml:space="preserve">Burt’s relational counter</w:t>
-      </w:r>
-      <w:r>
-        <w:t xml:space="preserve">, what do you owe him in that moment that the institution does not — and what, concretely, do you do?</w:t>
-      </w:r>
-    </w:p>
-    <w:p>
-      <w:pPr>
-        <w:pStyle w:val="Compact"/>
+        <w:t xml:space="preserve">You are the nurse assigned to Cowart’s daily tank treatment. He has just told you again that he wants it to stop and wants to die. What do you owe him in that moment that the institution does not? What, concretely, do you do?</w:t>
+      </w:r>
+    </w:p>
+    <w:p>
+      <w:pPr>
         <w:numPr>
           <w:ilvl w:val="0"/>
           <w:numId w:val="1006"/>
         </w:numPr>
       </w:pPr>
       <w:r>
-        <w:t xml:space="preserve">Apply the Arnold–Menzel procedure to Andrea Rubin’s case. Does the procedure yield the outcome Rubin endorses? If it does not, is that a flaw in the procedure, a difference between the two patients, or evidence that the argument Dax started is still unresolved?</w:t>
+        <w:t xml:space="preserve">Apply the Arnold–Menzel procedure to Andrea Rubin’s case. Does the procedure give the answer Rubin would endorse? If not, what does the mismatch tell you — is the procedure flawed, is Rubin’s case importantly different from Cowart’s, or is the argument Cowart started still open?</w:t>
       </w:r>
     </w:p>
     <w:bookmarkEnd w:id="21"/>

</xml_diff>

<commit_message>
Add Perusall quiz generation and validation tools
- Implemented `generate_perusall_quiz.py` to convert .quiz.json files into CSV format for Perusall quizzes, including features for shuffling answers and validating question styles.
- Created `quiz-format.txt` to provide guidelines for quiz formatting and design principles.
- Added a template JSON file `quiz-source-template.quiz.json` for users to create new quizzes.
- Introduced `quiz-template.csv` as a header template for generated quizzes.
- Developed `shuffle_perusall_answers.py` to randomize answer choices in existing CSV files while updating correct answer indices.
- Implemented `validate_perusall_csv.py` to validate CSV files against expected formats and house rules, checking for errors and warnings in quiz design.
</commit_message>
<xml_diff>
--- a/docs/cases/01-dax-cowart.docx
+++ b/docs/cases/01-dax-cowart.docx
@@ -91,7 +91,7 @@
         <w:t xml:space="preserve"> </w:t>
       </w:r>
       <w:r>
-        <w:t xml:space="preserve">Cowart (1947–2019), a 25-year-old former Air Force pilot from Henderson, Texas</w:t>
+        <w:t xml:space="preserve">Cowart (1947–2019), a 25-year-old former Air Force pilot from Henderson, Texas.</w:t>
       </w:r>
     </w:p>
     <w:p>
@@ -113,7 +113,7 @@
         <w:t xml:space="preserve"> </w:t>
       </w:r>
       <w:r>
-        <w:t xml:space="preserve">Burned over roughly two-thirds of his body in a 1973 propane explosion; he repeatedly, and competently, demanded that treatment stop and was overruled for more than a year</w:t>
+        <w:t xml:space="preserve">Burned over roughly two-thirds of his body in a 1973 propane explosion. He repeatedly, and competently, demanded that treatment stop, and was overruled for more than a year.</w:t>
       </w:r>
     </w:p>
     <w:p>
@@ -135,7 +135,7 @@
         <w:t xml:space="preserve"> </w:t>
       </w:r>
       <w:r>
-        <w:t xml:space="preserve">Parkland Memorial Hospital (Dallas), a rehabilitation hospital in Houston, and John Sealy Hospital at the University of Texas Medical Branch (Galveston), 1973–1974</w:t>
+        <w:t xml:space="preserve">Parkland Memorial Hospital (Dallas), a rehabilitation hospital in Houston, and John Sealy Hospital at the University of Texas Medical Branch (Galveston), 1973–1974.</w:t>
       </w:r>
     </w:p>
     <w:p>
@@ -157,7 +157,7 @@
         <w:t xml:space="preserve"> </w:t>
       </w:r>
       <w:r>
-        <w:t xml:space="preserve">Cowart’s case became the most-discussed American example of a collision between patient</w:t>
+        <w:t xml:space="preserve">Cowart’s case became the most-discussed American example of a clash between patient</w:t>
       </w:r>
       <w:r>
         <w:t xml:space="preserve"> </w:t>
@@ -220,7 +220,7 @@
         <w:pStyle w:val="FirstParagraph"/>
       </w:pPr>
       <w:r>
-        <w:t xml:space="preserve">On the afternoon of July 25, 1973, Dax Cowart and his father, Ray, drove out to look at a piece of rural land in east Texas. Dax — then christened Donald, a name he would later change — was twenty-five, a former high-school football captain, a rodeo rider, and an Air Force pilot recently back from service. He was, by every account including his own, a young man who took his strong, fast, capable body for granted.</w:t>
+        <w:t xml:space="preserve">On the afternoon of July 25, 1973, Dax Cowart and his father, Ray, drove out to look at a piece of rural land in east Texas. Dax — then named Donald, a name he would later change — was twenty-five. He was a former high-school football captain, a rodeo rider, and an Air Force pilot recently back from service. By every account, including his own, he was a young man who took his strong, fast, capable body for granted.</w:t>
       </w:r>
     </w:p>
     <w:p>
@@ -228,7 +228,7 @@
         <w:pStyle w:val="BodyText"/>
       </w:pPr>
       <w:r>
-        <w:t xml:space="preserve">They did not know that an underground propane pipeline near where they parked had been leaking, and that the gas had pooled, invisible and odorless to them, in the low ground around the car. When Ray turned the ignition to leave, a spark from the engine ignited it. The explosion threw Dax clear of a wall of fire. He ran through pine woods until he could not run anymore, beating at flames with hands that were already destroyed.</w:t>
+        <w:t xml:space="preserve">They did not know that an underground propane pipeline near where they parked had been leaking. The gas had pooled, invisible and odorless, in the low ground around the car. When Ray turned the ignition to leave, a spark from the engine ignited it. The explosion threw Dax clear of a wall of fire. He ran through pine woods until he could not run anymore, beating at flames with hands that were already destroyed.</w:t>
       </w:r>
     </w:p>
     <w:p>
@@ -252,15 +252,75 @@
         <w:t xml:space="preserve"> </w:t>
       </w:r>
       <w:r>
-        <w:t xml:space="preserve">Both men were taken to a small hospital in Kilgore, then transferred together — 140 miles, in the same ambulance — to the burn unit at Parkland Memorial Hospital in Dallas. Ray Cowart died on the way. Dax survived. Burns covered about 65% of his body; the deepest, third-degree burns destroyed the skin of his face, ears, and hands. He was blinded in both eyes. Most of his fingers were later amputated. He was conscious, and he stayed conscious.</w:t>
-      </w:r>
-    </w:p>
-    <w:p>
-      <w:pPr>
-        <w:pStyle w:val="BodyText"/>
-      </w:pPr>
-      <w:r>
-        <w:t xml:space="preserve">What followed was fourteen months of treatment that Cowart would describe, decades later and without exaggeration, as</w:t>
+        <w:t xml:space="preserve">Both men were taken to a small hospital in Kilgore, then transferred together — 140 miles, in the same ambulance — to the burn unit at Parkland Memorial Hospital in Dallas. Ray Cowart died on the way. Dax survived. The damage was severe:</w:t>
+      </w:r>
+    </w:p>
+    <w:p>
+      <w:pPr>
+        <w:pStyle w:val="Compact"/>
+        <w:numPr>
+          <w:ilvl w:val="0"/>
+          <w:numId w:val="1002"/>
+        </w:numPr>
+      </w:pPr>
+      <w:r>
+        <w:t xml:space="preserve">Burns covered about 65% of his body.</w:t>
+      </w:r>
+    </w:p>
+    <w:p>
+      <w:pPr>
+        <w:pStyle w:val="Compact"/>
+        <w:numPr>
+          <w:ilvl w:val="0"/>
+          <w:numId w:val="1002"/>
+        </w:numPr>
+      </w:pPr>
+      <w:r>
+        <w:t xml:space="preserve">The deepest, third-degree burns destroyed the skin of his face, ears, and hands.</w:t>
+      </w:r>
+    </w:p>
+    <w:p>
+      <w:pPr>
+        <w:pStyle w:val="Compact"/>
+        <w:numPr>
+          <w:ilvl w:val="0"/>
+          <w:numId w:val="1002"/>
+        </w:numPr>
+      </w:pPr>
+      <w:r>
+        <w:t xml:space="preserve">He was blinded in both eyes.</w:t>
+      </w:r>
+    </w:p>
+    <w:p>
+      <w:pPr>
+        <w:pStyle w:val="Compact"/>
+        <w:numPr>
+          <w:ilvl w:val="0"/>
+          <w:numId w:val="1002"/>
+        </w:numPr>
+      </w:pPr>
+      <w:r>
+        <w:t xml:space="preserve">Most of his fingers were later amputated.</w:t>
+      </w:r>
+    </w:p>
+    <w:p>
+      <w:pPr>
+        <w:pStyle w:val="Compact"/>
+        <w:numPr>
+          <w:ilvl w:val="0"/>
+          <w:numId w:val="1002"/>
+        </w:numPr>
+      </w:pPr>
+      <w:r>
+        <w:t xml:space="preserve">He was conscious, and he stayed conscious.</w:t>
+      </w:r>
+    </w:p>
+    <w:p>
+      <w:pPr>
+        <w:pStyle w:val="FirstParagraph"/>
+      </w:pPr>
+      <w:r>
+        <w:t xml:space="preserve">What followed was fourteen months of treatment that Cowart would later describe, without exaggeration, as</w:t>
       </w:r>
       <w:r>
         <w:t xml:space="preserve"> </w:t>
@@ -290,55 +350,81 @@
         <w:t xml:space="preserve"> </w:t>
       </w:r>
       <w:r>
-        <w:t xml:space="preserve">Burn depth is graded:</w:t>
-      </w:r>
-      <w:r>
-        <w:t xml:space="preserve"> </w:t>
-      </w:r>
-      <w:r>
-        <w:rPr>
-          <w:i/>
-          <w:iCs/>
-        </w:rPr>
-        <w:t xml:space="preserve">first-degree</w:t>
-      </w:r>
-      <w:r>
-        <w:t xml:space="preserve"> </w:t>
-      </w:r>
-      <w:r>
-        <w:t xml:space="preserve">burns affect only the outer skin (an ordinary sunburn);</w:t>
-      </w:r>
-      <w:r>
-        <w:t xml:space="preserve"> </w:t>
-      </w:r>
-      <w:r>
-        <w:rPr>
-          <w:i/>
-          <w:iCs/>
-        </w:rPr>
-        <w:t xml:space="preserve">second-degree</w:t>
-      </w:r>
-      <w:r>
-        <w:t xml:space="preserve"> </w:t>
-      </w:r>
-      <w:r>
-        <w:t xml:space="preserve">burns blister and are intensely painful;</w:t>
-      </w:r>
-      <w:r>
-        <w:t xml:space="preserve"> </w:t>
-      </w:r>
-      <w:r>
-        <w:rPr>
-          <w:i/>
-          <w:iCs/>
-        </w:rPr>
-        <w:t xml:space="preserve">third-degree</w:t>
-      </w:r>
-      <w:r>
-        <w:t xml:space="preserve"> </w:t>
-      </w:r>
-      <w:r>
-        <w:t xml:space="preserve">(full-thickness) burns destroy all skin layers. The amount burned is reported as percent of</w:t>
+        <w:t xml:space="preserve">Burn depth is graded by layer:</w:t>
+      </w:r>
+    </w:p>
+    <w:p>
+      <w:pPr>
+        <w:pStyle w:val="Compact"/>
+        <w:numPr>
+          <w:ilvl w:val="0"/>
+          <w:numId w:val="1003"/>
+        </w:numPr>
+      </w:pPr>
+      <w:r>
+        <w:rPr>
+          <w:i/>
+          <w:iCs/>
+        </w:rPr>
+        <w:t xml:space="preserve">First-degree</w:t>
+      </w:r>
+      <w:r>
+        <w:t xml:space="preserve"> </w:t>
+      </w:r>
+      <w:r>
+        <w:t xml:space="preserve">burns affect only the outer skin (an ordinary sunburn).</w:t>
+      </w:r>
+    </w:p>
+    <w:p>
+      <w:pPr>
+        <w:pStyle w:val="Compact"/>
+        <w:numPr>
+          <w:ilvl w:val="0"/>
+          <w:numId w:val="1003"/>
+        </w:numPr>
+      </w:pPr>
+      <w:r>
+        <w:rPr>
+          <w:i/>
+          <w:iCs/>
+        </w:rPr>
+        <w:t xml:space="preserve">Second-degree</w:t>
+      </w:r>
+      <w:r>
+        <w:t xml:space="preserve"> </w:t>
+      </w:r>
+      <w:r>
+        <w:t xml:space="preserve">burns blister and are intensely painful.</w:t>
+      </w:r>
+    </w:p>
+    <w:p>
+      <w:pPr>
+        <w:pStyle w:val="Compact"/>
+        <w:numPr>
+          <w:ilvl w:val="0"/>
+          <w:numId w:val="1003"/>
+        </w:numPr>
+      </w:pPr>
+      <w:r>
+        <w:rPr>
+          <w:i/>
+          <w:iCs/>
+        </w:rPr>
+        <w:t xml:space="preserve">Third-degree</w:t>
+      </w:r>
+      <w:r>
+        <w:t xml:space="preserve"> </w:t>
+      </w:r>
+      <w:r>
+        <w:t xml:space="preserve">(full-thickness) burns destroy all skin layers.</w:t>
+      </w:r>
+    </w:p>
+    <w:p>
+      <w:pPr>
+        <w:pStyle w:val="FirstParagraph"/>
+      </w:pPr>
+      <w:r>
+        <w:t xml:space="preserve">The amount burned is reported as percent of</w:t>
       </w:r>
       <w:r>
         <w:t xml:space="preserve"> </w:t>
@@ -350,7 +436,7 @@
         <w:t xml:space="preserve"> </w:t>
       </w:r>
       <w:r>
-        <w:t xml:space="preserve">(TBSA). At ~65% TBSA, much of it third-degree, Cowart was at the edge of what was survivable in 1973, and survival required</w:t>
+        <w:t xml:space="preserve">(TBSA). At ~65% TBSA, much of it third-degree, Cowart was at the edge of what was survivable in 1973. Survival required</w:t>
       </w:r>
       <w:r>
         <w:t xml:space="preserve"> </w:t>
@@ -383,7 +469,7 @@
         <w:pStyle w:val="BodyText"/>
       </w:pPr>
       <w:r>
-        <w:t xml:space="preserve">From very early on — at Parkland, and at every stage afterward — he asked the people treating him to stop. Not in passing, and not only when the pain was worst. He asked his doctors, his nurses, and his mother, repeatedly and consistently, to discontinue treatment and let him die. He understood what he was asking for. He understood that without the tankings and skin grafts he would die of infection within weeks. He wanted that outcome over the one being forced on him. He felt, he said, that he was</w:t>
+        <w:t xml:space="preserve">From the start — at Parkland, and at every stage afterward — Cowart asked the people treating him to stop. Not in passing, and not only when the pain was worst. He asked his doctors, his nurses, and his mother, again and again, to end treatment and let him die. He understood what he was asking for. He understood that without the tankings and skin grafts he would die of infection within weeks. He wanted that outcome over the one being forced on him. He felt, he said, that he was</w:t>
       </w:r>
       <w:r>
         <w:t xml:space="preserve"> </w:t>
@@ -397,7 +483,7 @@
         <w:pStyle w:val="BodyText"/>
       </w:pPr>
       <w:r>
-        <w:t xml:space="preserve">A psychiatrist, Dr. Robert B. White, was brought in to evaluate him at Galveston. The implied hope was that White would find Cowart too depressed or too overwhelmed to be making a real decision — which would have authorized treating him against his will with a clear conscience. White concluded the opposite. Cowart, he found, was</w:t>
+        <w:t xml:space="preserve">A psychiatrist, Dr. Robert B. White, was brought in to evaluate him at Galveston. The implied hope was that White would find Cowart too depressed or too overwhelmed to be making a real decision. That would have authorized treating him against his will with a clear conscience. White concluded the opposite. Cowart, he found, was</w:t>
       </w:r>
       <w:r>
         <w:t xml:space="preserve"> </w:t>
@@ -466,7 +552,7 @@
         <w:t xml:space="preserve">accepted the refusal</w:t>
       </w:r>
       <w:r>
-        <w:t xml:space="preserve">. For a moment, the system did what Cowart asked. Then his mother, Ada, his legal next of kin, and his attorney intervened and had him transferred to the burn unit at John Sealy Hospital in Galveston, where treatment — and the tankings — resumed under the unit’s director, Dr. Duane Larson. The decisive fact of the case is not that no one would listen. Someone did. He was moved away from the person who listened.</w:t>
+        <w:t xml:space="preserve">. For a moment, the system did what Cowart asked. Then his mother, Ada, his legal next of kin, and his attorney intervened. They had him transferred to the burn unit at John Sealy Hospital in Galveston, where treatment — and the tankings — resumed under the unit’s director, Dr. Duane Larson. The decisive fact of the case is not that no one would listen. Someone did. He was moved away from the person who listened.</w:t>
       </w:r>
     </w:p>
     <w:p>
@@ -474,7 +560,7 @@
         <w:pStyle w:val="BodyText"/>
       </w:pPr>
       <w:r>
-        <w:t xml:space="preserve">He survived, was discharged blind and severely disabled, and was, by his own description, deeply depressed for years; he attempted suicide more than once. Then his life changed. He earned a law degree from Texas Tech University in 1986, married, practiced law, and became one of the most articulate patient-rights advocates in the country. He died on April 28, 2019, at seventy-one, of complications from leukemia and liver cancer.</w:t>
+        <w:t xml:space="preserve">He survived, was discharged blind and severely disabled, and was, by his own description, deeply depressed for years. He attempted suicide more than once. Then his life changed. He earned a law degree from Texas Tech University in 1986, married, practiced law, and became one of the most articulate patient-rights advocates in the country. He died on April 28, 2019, at seventy-one, of complications from leukemia and liver cancer.</w:t>
       </w:r>
     </w:p>
     <w:p>
@@ -482,7 +568,23 @@
         <w:pStyle w:val="BodyText"/>
       </w:pPr>
       <w:r>
-        <w:t xml:space="preserve">For the rest of that life he said two things that many listeners could not hold together. He was glad to be alive. And his physicians had been wrong to keep him alive against his will. He did not think these statements contradicted each other. The good outcome, he insisted, was never the question. The question was whose decision it had been — and that question became one of the longest-running arguments in modern bioethics.</w:t>
+        <w:t xml:space="preserve">For the rest of that life he said two things that many listeners could not hold together. He was glad to be alive. And his physicians had been wrong to keep him alive against his will. He did not think these statements contradicted each other. The good outcome, he insisted, was never the question. The question was</w:t>
+      </w:r>
+      <w:r>
+        <w:t xml:space="preserve"> </w:t>
+      </w:r>
+      <w:r>
+        <w:rPr>
+          <w:i/>
+          <w:iCs/>
+        </w:rPr>
+        <w:t xml:space="preserve">whose decision it had been</w:t>
+      </w:r>
+      <w:r>
+        <w:t xml:space="preserve"> </w:t>
+      </w:r>
+      <w:r>
+        <w:t xml:space="preserve">— and that question became one of the longest-running arguments in modern bioethics.</w:t>
       </w:r>
     </w:p>
     <w:bookmarkEnd w:id="9"/>
@@ -500,7 +602,7 @@
         <w:pStyle w:val="FirstParagraph"/>
       </w:pPr>
       <w:r>
-        <w:t xml:space="preserve">What makes Cowart’s case central to bioethics is not the horror of the burns but the</w:t>
+        <w:t xml:space="preserve">What makes Cowart’s case central to bioethics is not the horror of the burns. It is the</w:t>
       </w:r>
       <w:r>
         <w:t xml:space="preserve"> </w:t>
@@ -516,7 +618,7 @@
         <w:t xml:space="preserve"> </w:t>
       </w:r>
       <w:r>
-        <w:t xml:space="preserve">it produced. Over fifty years, Cowart, his physicians, and a series of philosophers and lawyers built an argument, attacked it, repaired it, and attacked the repair. The pieces below trace that exchange as a connected dialogue — each move answering the one before.</w:t>
+        <w:t xml:space="preserve">it produced. Over fifty years, Cowart, his physicians, and a series of philosophers and lawyers built an argument, attacked it, repaired it, and attacked the repair. The pieces below trace that exchange as a connected dialogue. Each move answers the one before.</w:t>
       </w:r>
     </w:p>
     <w:bookmarkStart w:id="10" w:name="the-argument-from-autonomy"/>
@@ -579,7 +681,7 @@
         <w:pStyle w:val="Compact"/>
         <w:numPr>
           <w:ilvl w:val="0"/>
-          <w:numId w:val="1002"/>
+          <w:numId w:val="1004"/>
         </w:numPr>
       </w:pPr>
       <w:r>
@@ -591,7 +693,7 @@
         <w:pStyle w:val="Compact"/>
         <w:numPr>
           <w:ilvl w:val="0"/>
-          <w:numId w:val="1002"/>
+          <w:numId w:val="1004"/>
         </w:numPr>
       </w:pPr>
       <w:r>
@@ -603,7 +705,7 @@
         <w:pStyle w:val="Compact"/>
         <w:numPr>
           <w:ilvl w:val="0"/>
-          <w:numId w:val="1002"/>
+          <w:numId w:val="1004"/>
         </w:numPr>
       </w:pPr>
       <w:r>
@@ -615,7 +717,7 @@
         <w:pStyle w:val="FirstParagraph"/>
       </w:pPr>
       <w:r>
-        <w:t xml:space="preserve">Premise 1 is now close to settled doctrine; courts and ethicists broadly accept that bodily self-determination includes the right to decline care. So the argument’s whole weight falls on</w:t>
+        <w:t xml:space="preserve">Premise 1 is now close to settled doctrine. Courts and ethicists broadly accept that bodily self-determination includes the right to decline care. So the argument’s whole weight falls on</w:t>
       </w:r>
       <w:r>
         <w:t xml:space="preserve"> </w:t>
@@ -655,160 +757,7 @@
         <w:t xml:space="preserve"> </w:t>
       </w:r>
       <w:r>
-        <w:t xml:space="preserve">is a clinical judgment that a patient can (1) understand the relevant information, (2) appreciate how it applies to them, (3) reason about the options, and (4) communicate a choice. It is</w:t>
-      </w:r>
-      <w:r>
-        <w:t xml:space="preserve"> </w:t>
-      </w:r>
-      <w:r>
-        <w:rPr>
-          <w:i/>
-          <w:iCs/>
-        </w:rPr>
-        <w:t xml:space="preserve">decision-specific</w:t>
-      </w:r>
-      <w:r>
-        <w:t xml:space="preserve"> </w:t>
-      </w:r>
-      <w:r>
-        <w:t xml:space="preserve">and</w:t>
-      </w:r>
-      <w:r>
-        <w:t xml:space="preserve"> </w:t>
-      </w:r>
-      <w:r>
-        <w:rPr>
-          <w:i/>
-          <w:iCs/>
-        </w:rPr>
-        <w:t xml:space="preserve">time-specific</w:t>
-      </w:r>
-      <w:r>
-        <w:t xml:space="preserve">.</w:t>
-      </w:r>
-      <w:r>
-        <w:t xml:space="preserve"> </w:t>
-      </w:r>
-      <w:r>
-        <w:t xml:space="preserve">“Competence”</w:t>
-      </w:r>
-      <w:r>
-        <w:t xml:space="preserve"> </w:t>
-      </w:r>
-      <w:r>
-        <w:t xml:space="preserve">is the parallel legal term. When a patient lacks capacity, a</w:t>
-      </w:r>
-      <w:r>
-        <w:t xml:space="preserve"> </w:t>
-      </w:r>
-      <w:r>
-        <w:t xml:space="preserve">surrogate</w:t>
-      </w:r>
-      <w:r>
-        <w:t xml:space="preserve"> </w:t>
-      </w:r>
-      <w:r>
-        <w:t xml:space="preserve">(often next of kin) decides for them — but a surrogate has</w:t>
-      </w:r>
-      <w:r>
-        <w:t xml:space="preserve"> </w:t>
-      </w:r>
-      <w:r>
-        <w:rPr>
-          <w:b/>
-          <w:bCs/>
-        </w:rPr>
-        <w:t xml:space="preserve">no authority to override a patient who still has capacity</w:t>
-      </w:r>
-      <w:r>
-        <w:t xml:space="preserve">. Two psychiatrists found Cowart had capacity; his mother’s authorization was nonetheless treated as controlling. That is the legal pressure point premise 2 exposes.</w:t>
-      </w:r>
-    </w:p>
-    <w:bookmarkEnd w:id="10"/>
-    <w:bookmarkStart w:id="11" w:name="X5eb9fc164bcff9614b0f369d3b01ec9768cad6c"/>
-    <w:p>
-      <w:pPr>
-        <w:pStyle w:val="Heading3"/>
-      </w:pPr>
-      <w:r>
-        <w:t xml:space="preserve">The beneficence reply: pain, shock, and</w:t>
-      </w:r>
-      <w:r>
-        <w:t xml:space="preserve"> </w:t>
-      </w:r>
-      <w:r>
-        <w:t xml:space="preserve">“they almost always change their minds”</w:t>
-      </w:r>
-    </w:p>
-    <w:p>
-      <w:pPr>
-        <w:pStyle w:val="FirstParagraph"/>
-      </w:pPr>
-      <w:r>
-        <w:t xml:space="preserve">The physicians did not deny premise 1. They denied premise 2 — not that Cowart could</w:t>
-      </w:r>
-      <w:r>
-        <w:t xml:space="preserve"> </w:t>
-      </w:r>
-      <w:r>
-        <w:rPr>
-          <w:i/>
-          <w:iCs/>
-        </w:rPr>
-        <w:t xml:space="preserve">talk</w:t>
-      </w:r>
-      <w:r>
-        <w:t xml:space="preserve"> </w:t>
-      </w:r>
-      <w:r>
-        <w:t xml:space="preserve">coherently, but that a person in catastrophic pain, in shock, facing a future he could not yet imagine, is making a</w:t>
-      </w:r>
-      <w:r>
-        <w:t xml:space="preserve"> </w:t>
-      </w:r>
-      <w:r>
-        <w:rPr>
-          <w:i/>
-          <w:iCs/>
-        </w:rPr>
-        <w:t xml:space="preserve">settled, autonomous</w:t>
-      </w:r>
-      <w:r>
-        <w:t xml:space="preserve"> </w:t>
-      </w:r>
-      <w:r>
-        <w:t xml:space="preserve">choice rather than crying out from an unbearable present. Dr. Larson, on the film</w:t>
-      </w:r>
-      <w:r>
-        <w:t xml:space="preserve"> </w:t>
-      </w:r>
-      <w:r>
-        <w:rPr>
-          <w:i/>
-          <w:iCs/>
-        </w:rPr>
-        <w:t xml:space="preserve">Dax’s Case</w:t>
-      </w:r>
-      <w:r>
-        <w:t xml:space="preserve">, put both the conviction and its limit in one breath:</w:t>
-      </w:r>
-      <w:r>
-        <w:t xml:space="preserve"> </w:t>
-      </w:r>
-      <w:r>
-        <w:t xml:space="preserve">“No other burn patient has made it so clear … that they really do desire to die. … This is an ongoing battle that we have to individualize.”</w:t>
-      </w:r>
-    </w:p>
-    <w:p>
-      <w:pPr>
-        <w:pStyle w:val="BodyText"/>
-      </w:pPr>
-      <w:r>
-        <w:rPr>
-          <w:b/>
-          <w:bCs/>
-        </w:rPr>
-        <w:t xml:space="preserve">The Beneficence / Temporary-Incapacity Reply</w:t>
+        <w:t xml:space="preserve">is a clinical judgment that a patient can do four things:</w:t>
       </w:r>
     </w:p>
     <w:p>
@@ -816,11 +765,11 @@
         <w:pStyle w:val="Compact"/>
         <w:numPr>
           <w:ilvl w:val="0"/>
-          <w:numId w:val="1003"/>
+          <w:numId w:val="1005"/>
         </w:numPr>
       </w:pPr>
       <w:r>
-        <w:t xml:space="preserve">If a patient is in extreme pain and shock, their capacity to refuse treatment is undermined.</w:t>
+        <w:t xml:space="preserve">Understand the relevant information.</w:t>
       </w:r>
     </w:p>
     <w:p>
@@ -828,11 +777,11 @@
         <w:pStyle w:val="Compact"/>
         <w:numPr>
           <w:ilvl w:val="0"/>
-          <w:numId w:val="1003"/>
+          <w:numId w:val="1005"/>
         </w:numPr>
       </w:pPr>
       <w:r>
-        <w:t xml:space="preserve">Dax Cowart was in extreme pain and shock.</w:t>
+        <w:t xml:space="preserve">Appreciate how it applies to them.</w:t>
       </w:r>
     </w:p>
     <w:p>
@@ -840,10 +789,219 @@
         <w:pStyle w:val="Compact"/>
         <w:numPr>
           <w:ilvl w:val="0"/>
-          <w:numId w:val="1003"/>
+          <w:numId w:val="1005"/>
         </w:numPr>
       </w:pPr>
       <w:r>
+        <w:t xml:space="preserve">Reason about the options.</w:t>
+      </w:r>
+    </w:p>
+    <w:p>
+      <w:pPr>
+        <w:pStyle w:val="Compact"/>
+        <w:numPr>
+          <w:ilvl w:val="0"/>
+          <w:numId w:val="1005"/>
+        </w:numPr>
+      </w:pPr>
+      <w:r>
+        <w:t xml:space="preserve">Communicate a choice.</w:t>
+      </w:r>
+    </w:p>
+    <w:p>
+      <w:pPr>
+        <w:pStyle w:val="FirstParagraph"/>
+      </w:pPr>
+      <w:r>
+        <w:t xml:space="preserve">Capacity is</w:t>
+      </w:r>
+      <w:r>
+        <w:t xml:space="preserve"> </w:t>
+      </w:r>
+      <w:r>
+        <w:rPr>
+          <w:i/>
+          <w:iCs/>
+        </w:rPr>
+        <w:t xml:space="preserve">decision-specific</w:t>
+      </w:r>
+      <w:r>
+        <w:t xml:space="preserve"> </w:t>
+      </w:r>
+      <w:r>
+        <w:t xml:space="preserve">and</w:t>
+      </w:r>
+      <w:r>
+        <w:t xml:space="preserve"> </w:t>
+      </w:r>
+      <w:r>
+        <w:rPr>
+          <w:i/>
+          <w:iCs/>
+        </w:rPr>
+        <w:t xml:space="preserve">time-specific</w:t>
+      </w:r>
+      <w:r>
+        <w:t xml:space="preserve">.</w:t>
+      </w:r>
+      <w:r>
+        <w:t xml:space="preserve"> </w:t>
+      </w:r>
+      <w:r>
+        <w:t xml:space="preserve">“Competence”</w:t>
+      </w:r>
+      <w:r>
+        <w:t xml:space="preserve"> </w:t>
+      </w:r>
+      <w:r>
+        <w:t xml:space="preserve">is the parallel legal term. When a patient lacks capacity, a</w:t>
+      </w:r>
+      <w:r>
+        <w:t xml:space="preserve"> </w:t>
+      </w:r>
+      <w:r>
+        <w:t xml:space="preserve">surrogate</w:t>
+      </w:r>
+      <w:r>
+        <w:t xml:space="preserve"> </w:t>
+      </w:r>
+      <w:r>
+        <w:t xml:space="preserve">(often next of kin) decides for them — but a surrogate has</w:t>
+      </w:r>
+      <w:r>
+        <w:t xml:space="preserve"> </w:t>
+      </w:r>
+      <w:r>
+        <w:rPr>
+          <w:b/>
+          <w:bCs/>
+        </w:rPr>
+        <w:t xml:space="preserve">no authority to override a patient who still has capacity</w:t>
+      </w:r>
+      <w:r>
+        <w:t xml:space="preserve">. Two psychiatrists found Cowart had capacity. His mother’s authorization was nonetheless treated as controlling. That is the legal pressure point premise 2 exposes.</w:t>
+      </w:r>
+    </w:p>
+    <w:bookmarkEnd w:id="10"/>
+    <w:bookmarkStart w:id="11" w:name="X5eb9fc164bcff9614b0f369d3b01ec9768cad6c"/>
+    <w:p>
+      <w:pPr>
+        <w:pStyle w:val="Heading3"/>
+      </w:pPr>
+      <w:r>
+        <w:t xml:space="preserve">The beneficence reply: pain, shock, and</w:t>
+      </w:r>
+      <w:r>
+        <w:t xml:space="preserve"> </w:t>
+      </w:r>
+      <w:r>
+        <w:t xml:space="preserve">“they almost always change their minds”</w:t>
+      </w:r>
+    </w:p>
+    <w:p>
+      <w:pPr>
+        <w:pStyle w:val="FirstParagraph"/>
+      </w:pPr>
+      <w:r>
+        <w:t xml:space="preserve">The physicians did not deny premise 1. They denied premise 2. Their claim was not that Cowart could not</w:t>
+      </w:r>
+      <w:r>
+        <w:t xml:space="preserve"> </w:t>
+      </w:r>
+      <w:r>
+        <w:rPr>
+          <w:i/>
+          <w:iCs/>
+        </w:rPr>
+        <w:t xml:space="preserve">talk</w:t>
+      </w:r>
+      <w:r>
+        <w:t xml:space="preserve"> </w:t>
+      </w:r>
+      <w:r>
+        <w:t xml:space="preserve">coherently. It was that a person in catastrophic pain, in shock, facing a future he could not yet imagine, is not making a</w:t>
+      </w:r>
+      <w:r>
+        <w:t xml:space="preserve"> </w:t>
+      </w:r>
+      <w:r>
+        <w:rPr>
+          <w:i/>
+          <w:iCs/>
+        </w:rPr>
+        <w:t xml:space="preserve">settled, autonomous</w:t>
+      </w:r>
+      <w:r>
+        <w:t xml:space="preserve"> </w:t>
+      </w:r>
+      <w:r>
+        <w:t xml:space="preserve">choice. He is crying out from an unbearable present. Dr. Larson, on the film</w:t>
+      </w:r>
+      <w:r>
+        <w:t xml:space="preserve"> </w:t>
+      </w:r>
+      <w:r>
+        <w:rPr>
+          <w:i/>
+          <w:iCs/>
+        </w:rPr>
+        <w:t xml:space="preserve">Dax’s Case</w:t>
+      </w:r>
+      <w:r>
+        <w:t xml:space="preserve">, put both the conviction and its limit in one breath:</w:t>
+      </w:r>
+      <w:r>
+        <w:t xml:space="preserve"> </w:t>
+      </w:r>
+      <w:r>
+        <w:t xml:space="preserve">“No other burn patient has made it so clear … that they really do desire to die. … This is an ongoing battle that we have to individualize.”</w:t>
+      </w:r>
+    </w:p>
+    <w:p>
+      <w:pPr>
+        <w:pStyle w:val="BodyText"/>
+      </w:pPr>
+      <w:r>
+        <w:rPr>
+          <w:b/>
+          <w:bCs/>
+        </w:rPr>
+        <w:t xml:space="preserve">The Beneficence / Temporary-Incapacity Reply</w:t>
+      </w:r>
+    </w:p>
+    <w:p>
+      <w:pPr>
+        <w:pStyle w:val="Compact"/>
+        <w:numPr>
+          <w:ilvl w:val="0"/>
+          <w:numId w:val="1006"/>
+        </w:numPr>
+      </w:pPr>
+      <w:r>
+        <w:t xml:space="preserve">If a patient is in extreme pain and shock, their capacity to refuse treatment is undermined.</w:t>
+      </w:r>
+    </w:p>
+    <w:p>
+      <w:pPr>
+        <w:pStyle w:val="Compact"/>
+        <w:numPr>
+          <w:ilvl w:val="0"/>
+          <w:numId w:val="1006"/>
+        </w:numPr>
+      </w:pPr>
+      <w:r>
+        <w:t xml:space="preserve">Dax Cowart was in extreme pain and shock.</w:t>
+      </w:r>
+    </w:p>
+    <w:p>
+      <w:pPr>
+        <w:pStyle w:val="Compact"/>
+        <w:numPr>
+          <w:ilvl w:val="0"/>
+          <w:numId w:val="1006"/>
+        </w:numPr>
+      </w:pPr>
+      <w:r>
         <w:t xml:space="preserve">Therefore, Dax Cowart lacked the capacity to refuse treatment.</w:t>
       </w:r>
     </w:p>
@@ -868,7 +1026,7 @@
         <w:t xml:space="preserve"> </w:t>
       </w:r>
       <w:r>
-        <w:t xml:space="preserve">essays as a genuine conflict</w:t>
+        <w:t xml:space="preserve">essays. He called it a genuine conflict</w:t>
       </w:r>
       <w:r>
         <w:t xml:space="preserve"> </w:t>
@@ -900,7 +1058,43 @@
         <w:t xml:space="preserve">)</w:t>
       </w:r>
       <w:r>
-        <w:t xml:space="preserve">. It also has empirical backing that did not exist when commentators first took Cowart’s side. A 1978 NIH consensus statement held that shock makes early decision-making nearly impossible for burn victims, and in a later study burn survivors interviewed years afterward said almost uniformly that informed consent was unrealistic at the moment of injury, that the capacity to consent</w:t>
+        <w:t xml:space="preserve">. The reply also has empirical backing that did not exist when commentators first took Cowart’s side:</w:t>
+      </w:r>
+    </w:p>
+    <w:p>
+      <w:pPr>
+        <w:pStyle w:val="Compact"/>
+        <w:numPr>
+          <w:ilvl w:val="0"/>
+          <w:numId w:val="1007"/>
+        </w:numPr>
+      </w:pPr>
+      <w:r>
+        <w:t xml:space="preserve">A 1978 NIH consensus statement held that shock makes early decision-making nearly impossible for burn victims.</w:t>
+      </w:r>
+    </w:p>
+    <w:p>
+      <w:pPr>
+        <w:pStyle w:val="Compact"/>
+        <w:numPr>
+          <w:ilvl w:val="0"/>
+          <w:numId w:val="1007"/>
+        </w:numPr>
+      </w:pPr>
+      <w:r>
+        <w:t xml:space="preserve">In a later study, burn survivors interviewed years afterward said almost uniformly that informed consent was unrealistic at the moment of injury.</w:t>
+      </w:r>
+    </w:p>
+    <w:p>
+      <w:pPr>
+        <w:pStyle w:val="Compact"/>
+        <w:numPr>
+          <w:ilvl w:val="0"/>
+          <w:numId w:val="1007"/>
+        </w:numPr>
+      </w:pPr>
+      <w:r>
+        <w:t xml:space="preserve">They said the capacity to consent</w:t>
       </w:r>
       <w:r>
         <w:t xml:space="preserve"> </w:t>
@@ -913,7 +1107,19 @@
         <w:t xml:space="preserve">developed over time</w:t>
       </w:r>
       <w:r>
-        <w:t xml:space="preserve">, and that none thought withdrawing support would have been right for them</w:t>
+        <w:t xml:space="preserve">.</w:t>
+      </w:r>
+    </w:p>
+    <w:p>
+      <w:pPr>
+        <w:pStyle w:val="Compact"/>
+        <w:numPr>
+          <w:ilvl w:val="0"/>
+          <w:numId w:val="1007"/>
+        </w:numPr>
+      </w:pPr>
+      <w:r>
+        <w:t xml:space="preserve">None thought withdrawing support would have been right for them</w:t>
       </w:r>
       <w:r>
         <w:t xml:space="preserve"> </w:t>
@@ -938,7 +1144,7 @@
     </w:p>
     <w:p>
       <w:pPr>
-        <w:pStyle w:val="BodyText"/>
+        <w:pStyle w:val="FirstParagraph"/>
       </w:pPr>
       <w:r>
         <w:rPr>
@@ -957,7 +1163,7 @@
         <w:t xml:space="preserve"> </w:t>
       </w:r>
       <w:r>
-        <w:t xml:space="preserve">— disclosure plus free agreement before treatment — was barely a decade old in law in 1973;</w:t>
+        <w:t xml:space="preserve">— disclosure plus free agreement before treatment — was barely a decade old in law in 1973.</w:t>
       </w:r>
       <w:r>
         <w:t xml:space="preserve"> </w:t>
@@ -1014,7 +1220,7 @@
         <w:t xml:space="preserve"> </w:t>
       </w:r>
       <w:r>
-        <w:t xml:space="preserve">(a competent patient’s right to</w:t>
+        <w:t xml:space="preserve">— a competent patient’s right to</w:t>
       </w:r>
       <w:r>
         <w:t xml:space="preserve"> </w:t>
@@ -1030,7 +1236,7 @@
         <w:t xml:space="preserve"> </w:t>
       </w:r>
       <w:r>
-        <w:t xml:space="preserve">life-saving care), was almost unrecognized. Many physicians trained in an older</w:t>
+        <w:t xml:space="preserve">life-saving care — was almost unrecognized. Many physicians trained in an older</w:t>
       </w:r>
       <w:r>
         <w:t xml:space="preserve"> </w:t>
@@ -1042,7 +1248,7 @@
         <w:t xml:space="preserve"> </w:t>
       </w:r>
       <w:r>
-        <w:t xml:space="preserve">model treated refusal of life-saving treatment as itself evidence of impaired judgment — which is precisely the reasoning premise 1 of the reply formalizes (see</w:t>
+        <w:t xml:space="preserve">model treated refusal of life-saving treatment as itself evidence of impaired judgment. That is precisely the reasoning premise 1 of the reply formalizes (see</w:t>
       </w:r>
       <w:r>
         <w:t xml:space="preserve"> </w:t>
@@ -1114,7 +1320,7 @@
         <w:t xml:space="preserve"> </w:t>
       </w:r>
       <w:r>
-        <w:t xml:space="preserve">move (maximize good outcomes across the class of burn patients), and it invites the objection Cowart spent his life pressing.</w:t>
+        <w:t xml:space="preserve">move: maximize good outcomes across the class of burn patients. It invites the objection Cowart spent his life pressing.</w:t>
       </w:r>
     </w:p>
     <w:bookmarkEnd w:id="11"/>
@@ -1164,7 +1370,7 @@
         <w:pStyle w:val="Compact"/>
         <w:numPr>
           <w:ilvl w:val="0"/>
-          <w:numId w:val="1004"/>
+          <w:numId w:val="1008"/>
         </w:numPr>
       </w:pPr>
       <w:r>
@@ -1176,7 +1382,7 @@
         <w:pStyle w:val="Compact"/>
         <w:numPr>
           <w:ilvl w:val="0"/>
-          <w:numId w:val="1004"/>
+          <w:numId w:val="1008"/>
         </w:numPr>
       </w:pPr>
       <w:r>
@@ -1188,7 +1394,7 @@
         <w:pStyle w:val="Compact"/>
         <w:numPr>
           <w:ilvl w:val="0"/>
-          <w:numId w:val="1004"/>
+          <w:numId w:val="1008"/>
         </w:numPr>
       </w:pPr>
       <w:r>
@@ -1200,7 +1406,15 @@
         <w:pStyle w:val="FirstParagraph"/>
       </w:pPr>
       <w:r>
-        <w:t xml:space="preserve">He sharpened it with an analogy: a surgeon who operates on the wrong patient is not vindicated because the patient happens to recover. And this is where a concept from ethical theory does real work. Cowart’s two claims —</w:t>
+        <w:t xml:space="preserve">He sharpened it with an analogy: a surgeon who operates on the wrong patient is not vindicated because the patient happens to recover.</w:t>
+      </w:r>
+    </w:p>
+    <w:p>
+      <w:pPr>
+        <w:pStyle w:val="BodyText"/>
+      </w:pPr>
+      <w:r>
+        <w:t xml:space="preserve">This is where a concept from ethical theory does real work. Cowart’s two claims —</w:t>
       </w:r>
       <w:r>
         <w:t xml:space="preserve"> </w:t>
@@ -1232,7 +1446,7 @@
         <w:t xml:space="preserve"> </w:t>
       </w:r>
       <w:r>
-        <w:t xml:space="preserve">— are not a contradiction; they are a textbook case of</w:t>
+        <w:t xml:space="preserve">— are not a contradiction. They are a textbook case of</w:t>
       </w:r>
       <w:r>
         <w:t xml:space="preserve"> </w:t>
@@ -1241,7 +1455,7 @@
         <w:t xml:space="preserve">moral residue</w:t>
       </w:r>
       <w:r>
-        <w:t xml:space="preserve">: even when overriding a duty is, on balance, defensible, the overridden duty does not vanish, and something wrongful remains to be acknowledged. As he said:</w:t>
+        <w:t xml:space="preserve">: even when overriding a duty is, on balance, defensible, the overridden duty does not vanish. Something wrongful remains to be acknowledged. As he said:</w:t>
       </w:r>
       <w:r>
         <w:t xml:space="preserve"> </w:t>
@@ -1279,7 +1493,7 @@
         <w:t xml:space="preserve"> </w:t>
       </w:r>
       <w:r>
-        <w:t xml:space="preserve">angle the same point is that treating a competent person merely as a means to a future</w:t>
+        <w:t xml:space="preserve">angle, the same point is that treating a competent person merely as a means to a future</w:t>
       </w:r>
       <w:r>
         <w:t xml:space="preserve"> </w:t>
@@ -1339,7 +1553,7 @@
         <w:pStyle w:val="Compact"/>
         <w:numPr>
           <w:ilvl w:val="0"/>
-          <w:numId w:val="1005"/>
+          <w:numId w:val="1009"/>
         </w:numPr>
       </w:pPr>
       <w:r>
@@ -1351,7 +1565,7 @@
         <w:pStyle w:val="Compact"/>
         <w:numPr>
           <w:ilvl w:val="0"/>
-          <w:numId w:val="1005"/>
+          <w:numId w:val="1009"/>
         </w:numPr>
       </w:pPr>
       <w:r>
@@ -1363,7 +1577,7 @@
         <w:pStyle w:val="Compact"/>
         <w:numPr>
           <w:ilvl w:val="0"/>
-          <w:numId w:val="1005"/>
+          <w:numId w:val="1009"/>
         </w:numPr>
       </w:pPr>
       <w:r>
@@ -1403,7 +1617,7 @@
         <w:t xml:space="preserve"> </w:t>
       </w:r>
       <w:r>
-        <w:t xml:space="preserve">— conceding that staying cannot be indefinite, because a relationship that never lets the patient’s</w:t>
+        <w:t xml:space="preserve">He conceded that staying cannot be indefinite, because a relationship that never lets the patient’s</w:t>
       </w:r>
       <w:r>
         <w:t xml:space="preserve"> </w:t>
@@ -1458,10 +1672,7 @@
         <w:t xml:space="preserve">unanswered question</w:t>
       </w:r>
       <w:r>
-        <w:t xml:space="preserve"> </w:t>
-      </w:r>
-      <w:r>
-        <w:t xml:space="preserve">— when, exactly, does resistance to a competent refusal have to yield? — and proposed a step-by-step procedure to answer it without smuggling paternalism back in. Their guiding question reframes the whole debate away from absolute rights: not</w:t>
+        <w:t xml:space="preserve">: when, exactly, does resistance to a competent refusal have to yield? They proposed a step-by-step procedure to answer it without smuggling paternalism back in. Their guiding question reframes the whole debate away from absolute rights. Not</w:t>
       </w:r>
       <w:r>
         <w:t xml:space="preserve"> </w:t>
@@ -1564,7 +1775,7 @@
         <w:t xml:space="preserve">balancing</w:t>
       </w:r>
       <w:r>
-        <w:t xml:space="preserve">: it takes two abstract principles that conflict in the abstract — respect for autonomy and beneficence — and turns them into a concrete sequence a real clinical team can follow at the bedside. The decisive split is whether the patient’s pain is being adequately controlled, because uncontrolled pain both clouds judgment</w:t>
+        <w:t xml:space="preserve">. It takes two abstract principles that conflict in the abstract — respect for autonomy and beneficence — and turns them into a concrete sequence a real clinical team can follow at the bedside. The decisive split is whether the patient’s pain is being adequately controlled. Uncontrolled pain both clouds judgment</w:t>
       </w:r>
       <w:r>
         <w:t xml:space="preserve"> </w:t>
@@ -1590,7 +1801,7 @@
           <w:i/>
           <w:iCs/>
         </w:rPr>
-        <w:t xml:space="preserve">first fix the pain or honor a short waiting period; either way, the patient — not the team and not the family — ends up holding the decision.</w:t>
+        <w:t xml:space="preserve">first fix the pain or honor a short waiting period. Either way, the patient — not the team and not the family — ends up holding the decision.</w:t>
       </w:r>
     </w:p>
     <w:tbl>
@@ -1714,11 +1925,17 @@
         <w:pStyle w:val="FirstParagraph"/>
       </w:pPr>
       <w:r>
-        <w:t xml:space="preserve">Cowart’s case itself never produced a court ruling; the legal architecture grew up around it.</w:t>
-      </w:r>
-      <w:r>
-        <w:t xml:space="preserve"> </w:t>
-      </w:r>
+        <w:t xml:space="preserve">Cowart’s case itself never produced a court ruling. The legal architecture grew up around it. Two cases were decisive:</w:t>
+      </w:r>
+    </w:p>
+    <w:p>
+      <w:pPr>
+        <w:pStyle w:val="Compact"/>
+        <w:numPr>
+          <w:ilvl w:val="0"/>
+          <w:numId w:val="1010"/>
+        </w:numPr>
+      </w:pPr>
       <w:r>
         <w:rPr>
           <w:i/>
@@ -1750,11 +1967,17 @@
         <w:t xml:space="preserve">)</w:t>
       </w:r>
       <w:r>
-        <w:t xml:space="preserve">, and</w:t>
-      </w:r>
-      <w:r>
-        <w:t xml:space="preserve"> </w:t>
-      </w:r>
+        <w:t xml:space="preserve">.</w:t>
+      </w:r>
+    </w:p>
+    <w:p>
+      <w:pPr>
+        <w:pStyle w:val="Compact"/>
+        <w:numPr>
+          <w:ilvl w:val="0"/>
+          <w:numId w:val="1010"/>
+        </w:numPr>
+      </w:pPr>
       <w:r>
         <w:rPr>
           <w:i/>
@@ -1766,7 +1989,7 @@
         <w:t xml:space="preserve"> </w:t>
       </w:r>
       <w:r>
-        <w:t xml:space="preserve">(1990) treated the refusal of such treatment as a protected liberty while letting states demand clear evidence of the patient’s wishes</w:t>
+        <w:t xml:space="preserve">(1990) treated the refusal of such treatment as a protected liberty, while letting states demand clear evidence of the patient’s wishes</w:t>
       </w:r>
       <w:r>
         <w:t xml:space="preserve"> </w:t>
@@ -1786,7 +2009,15 @@
         <w:t xml:space="preserve">)</w:t>
       </w:r>
       <w:r>
-        <w:t xml:space="preserve">; out of that lineage came living wills, durable powers of attorney, and the federal Patient Self-Determination Act. The law moved Cowart’s way. The bedside did not always follow: in a 2019 remembrance, the bioethicist Greg Pence reported a burn physician saying, of patients who ask to die,</w:t>
+        <w:t xml:space="preserve">.</w:t>
+      </w:r>
+    </w:p>
+    <w:p>
+      <w:pPr>
+        <w:pStyle w:val="FirstParagraph"/>
+      </w:pPr>
+      <w:r>
+        <w:t xml:space="preserve">Out of that lineage came living wills, durable powers of attorney, and the federal Patient Self-Determination Act. The law moved Cowart’s way. The bedside did not always follow. In a 2019 remembrance, the bioethicist Greg Pence reported a burn physician saying, of patients who ask to die,</w:t>
       </w:r>
       <w:r>
         <w:t xml:space="preserve"> </w:t>
@@ -1812,7 +2043,7 @@
         <w:t xml:space="preserve">)</w:t>
       </w:r>
       <w:r>
-        <w:t xml:space="preserve">. Advance directives, when they exist, are quietly overridden a large share of the time. The doctrine settled; the disagreement did not.</w:t>
+        <w:t xml:space="preserve">. Advance directives, when they exist, are quietly overridden a large share of the time. The doctrine settled. The disagreement did not.</w:t>
       </w:r>
     </w:p>
     <w:p>
@@ -1840,7 +2071,55 @@
         <w:t xml:space="preserve">)</w:t>
       </w:r>
       <w:r>
-        <w:t xml:space="preserve">. She sets beside Dax the case of Andrea Rubin, severely burned in 2014 with comparable injuries. Rubin’s friends, like Dax, pleaded that she would not want to live this way; her father, like Dax’s mother, consented; she was sedated for weeks and could not decide. After recovery, Rubin did</w:t>
+        <w:t xml:space="preserve">. She sets beside Dax the case of Andrea Rubin, severely burned in 2014 with comparable injuries. The two cases ran in parallel:</w:t>
+      </w:r>
+    </w:p>
+    <w:p>
+      <w:pPr>
+        <w:pStyle w:val="Compact"/>
+        <w:numPr>
+          <w:ilvl w:val="0"/>
+          <w:numId w:val="1011"/>
+        </w:numPr>
+      </w:pPr>
+      <w:r>
+        <w:t xml:space="preserve">Rubin’s friends, like Dax’s, pleaded that she would not want to live this way.</w:t>
+      </w:r>
+    </w:p>
+    <w:p>
+      <w:pPr>
+        <w:pStyle w:val="Compact"/>
+        <w:numPr>
+          <w:ilvl w:val="0"/>
+          <w:numId w:val="1011"/>
+        </w:numPr>
+      </w:pPr>
+      <w:r>
+        <w:t xml:space="preserve">Her father, like Dax’s mother, consented to treatment.</w:t>
+      </w:r>
+    </w:p>
+    <w:p>
+      <w:pPr>
+        <w:pStyle w:val="Compact"/>
+        <w:numPr>
+          <w:ilvl w:val="0"/>
+          <w:numId w:val="1011"/>
+        </w:numPr>
+      </w:pPr>
+      <w:r>
+        <w:t xml:space="preserve">She was sedated for weeks and could not decide.</w:t>
+      </w:r>
+    </w:p>
+    <w:p>
+      <w:pPr>
+        <w:pStyle w:val="Compact"/>
+        <w:numPr>
+          <w:ilvl w:val="0"/>
+          <w:numId w:val="1011"/>
+        </w:numPr>
+      </w:pPr>
+      <w:r>
+        <w:t xml:space="preserve">After recovery, Rubin did</w:t>
       </w:r>
       <w:r>
         <w:t xml:space="preserve"> </w:t>
@@ -1861,10 +2140,10 @@
     </w:p>
     <w:p>
       <w:pPr>
-        <w:pStyle w:val="BodyText"/>
-      </w:pPr>
-      <w:r>
-        <w:t xml:space="preserve">Rubin’s case does not refute Cowart — two psychiatrists found</w:t>
+        <w:pStyle w:val="FirstParagraph"/>
+      </w:pPr>
+      <w:r>
+        <w:t xml:space="preserve">Rubin’s case does not refute Cowart. Two psychiatrists found</w:t>
       </w:r>
       <w:r>
         <w:t xml:space="preserve"> </w:t>
@@ -1880,7 +2159,7 @@
         <w:t xml:space="preserve"> </w:t>
       </w:r>
       <w:r>
-        <w:t xml:space="preserve">had capacity, and hers is also just one story. What it does is reopen premise 2 of the original autonomy argument as a genuinely empirical question that cannot be settled from a single famous case: capacity in catastrophic injury is harder to read, and more variable across people, than either</w:t>
+        <w:t xml:space="preserve">had capacity, and hers is also just one story. What it does is reopen premise 2 of the original autonomy argument as a genuinely empirical question that cannot be settled from a single famous case. Capacity in catastrophic injury is harder to read, and more variable across people, than either</w:t>
       </w:r>
       <w:r>
         <w:t xml:space="preserve"> </w:t>
@@ -1950,7 +2229,7 @@
       <w:pPr>
         <w:numPr>
           <w:ilvl w:val="0"/>
-          <w:numId w:val="1006"/>
+          <w:numId w:val="1012"/>
         </w:numPr>
       </w:pPr>
       <w:r>
@@ -2009,7 +2288,7 @@
       <w:pPr>
         <w:numPr>
           <w:ilvl w:val="0"/>
-          <w:numId w:val="1006"/>
+          <w:numId w:val="1012"/>
         </w:numPr>
       </w:pPr>
       <w:r>
@@ -2045,7 +2324,7 @@
       <w:pPr>
         <w:numPr>
           <w:ilvl w:val="0"/>
-          <w:numId w:val="1006"/>
+          <w:numId w:val="1012"/>
         </w:numPr>
       </w:pPr>
       <w:r>
@@ -2068,7 +2347,7 @@
       <w:pPr>
         <w:numPr>
           <w:ilvl w:val="0"/>
-          <w:numId w:val="1006"/>
+          <w:numId w:val="1012"/>
         </w:numPr>
       </w:pPr>
       <w:r>
@@ -2079,7 +2358,7 @@
       <w:pPr>
         <w:numPr>
           <w:ilvl w:val="0"/>
-          <w:numId w:val="1006"/>
+          <w:numId w:val="1012"/>
         </w:numPr>
       </w:pPr>
       <w:r>
@@ -2101,7 +2380,7 @@
         <w:pStyle w:val="Compact"/>
         <w:numPr>
           <w:ilvl w:val="0"/>
-          <w:numId w:val="1007"/>
+          <w:numId w:val="1013"/>
         </w:numPr>
       </w:pPr>
       <w:r>
@@ -2139,7 +2418,7 @@
         <w:pStyle w:val="Compact"/>
         <w:numPr>
           <w:ilvl w:val="0"/>
-          <w:numId w:val="1007"/>
+          <w:numId w:val="1013"/>
         </w:numPr>
       </w:pPr>
       <w:r>
@@ -2187,7 +2466,7 @@
         <w:pStyle w:val="Compact"/>
         <w:numPr>
           <w:ilvl w:val="0"/>
-          <w:numId w:val="1007"/>
+          <w:numId w:val="1013"/>
         </w:numPr>
       </w:pPr>
       <w:r>
@@ -2231,7 +2510,7 @@
         <w:pStyle w:val="Compact"/>
         <w:numPr>
           <w:ilvl w:val="0"/>
-          <w:numId w:val="1007"/>
+          <w:numId w:val="1013"/>
         </w:numPr>
       </w:pPr>
       <w:r>
@@ -3117,64 +3396,10 @@
     <w:abstractNumId w:val="991"/>
   </w:num>
   <w:num w:numId="1002">
-    <w:abstractNumId w:val="99411"/>
-    <w:lvlOverride w:ilvl="0">
-      <w:startOverride w:val="1"/>
-    </w:lvlOverride>
-    <w:lvlOverride w:ilvl="1">
-      <w:startOverride w:val="1"/>
-    </w:lvlOverride>
-    <w:lvlOverride w:ilvl="2">
-      <w:startOverride w:val="1"/>
-    </w:lvlOverride>
-    <w:lvlOverride w:ilvl="3">
-      <w:startOverride w:val="1"/>
-    </w:lvlOverride>
-    <w:lvlOverride w:ilvl="4">
-      <w:startOverride w:val="1"/>
-    </w:lvlOverride>
-    <w:lvlOverride w:ilvl="5">
-      <w:startOverride w:val="1"/>
-    </w:lvlOverride>
-    <w:lvlOverride w:ilvl="6">
-      <w:startOverride w:val="1"/>
-    </w:lvlOverride>
-    <w:lvlOverride w:ilvl="7">
-      <w:startOverride w:val="1"/>
-    </w:lvlOverride>
-    <w:lvlOverride w:ilvl="8">
-      <w:startOverride w:val="1"/>
-    </w:lvlOverride>
+    <w:abstractNumId w:val="991"/>
   </w:num>
   <w:num w:numId="1003">
-    <w:abstractNumId w:val="99411"/>
-    <w:lvlOverride w:ilvl="0">
-      <w:startOverride w:val="1"/>
-    </w:lvlOverride>
-    <w:lvlOverride w:ilvl="1">
-      <w:startOverride w:val="1"/>
-    </w:lvlOverride>
-    <w:lvlOverride w:ilvl="2">
-      <w:startOverride w:val="1"/>
-    </w:lvlOverride>
-    <w:lvlOverride w:ilvl="3">
-      <w:startOverride w:val="1"/>
-    </w:lvlOverride>
-    <w:lvlOverride w:ilvl="4">
-      <w:startOverride w:val="1"/>
-    </w:lvlOverride>
-    <w:lvlOverride w:ilvl="5">
-      <w:startOverride w:val="1"/>
-    </w:lvlOverride>
-    <w:lvlOverride w:ilvl="6">
-      <w:startOverride w:val="1"/>
-    </w:lvlOverride>
-    <w:lvlOverride w:ilvl="7">
-      <w:startOverride w:val="1"/>
-    </w:lvlOverride>
-    <w:lvlOverride w:ilvl="8">
-      <w:startOverride w:val="1"/>
-    </w:lvlOverride>
+    <w:abstractNumId w:val="991"/>
   </w:num>
   <w:num w:numId="1004">
     <w:abstractNumId w:val="99411"/>
@@ -3267,6 +3492,105 @@
     </w:lvlOverride>
   </w:num>
   <w:num w:numId="1007">
+    <w:abstractNumId w:val="991"/>
+  </w:num>
+  <w:num w:numId="1008">
+    <w:abstractNumId w:val="99411"/>
+    <w:lvlOverride w:ilvl="0">
+      <w:startOverride w:val="1"/>
+    </w:lvlOverride>
+    <w:lvlOverride w:ilvl="1">
+      <w:startOverride w:val="1"/>
+    </w:lvlOverride>
+    <w:lvlOverride w:ilvl="2">
+      <w:startOverride w:val="1"/>
+    </w:lvlOverride>
+    <w:lvlOverride w:ilvl="3">
+      <w:startOverride w:val="1"/>
+    </w:lvlOverride>
+    <w:lvlOverride w:ilvl="4">
+      <w:startOverride w:val="1"/>
+    </w:lvlOverride>
+    <w:lvlOverride w:ilvl="5">
+      <w:startOverride w:val="1"/>
+    </w:lvlOverride>
+    <w:lvlOverride w:ilvl="6">
+      <w:startOverride w:val="1"/>
+    </w:lvlOverride>
+    <w:lvlOverride w:ilvl="7">
+      <w:startOverride w:val="1"/>
+    </w:lvlOverride>
+    <w:lvlOverride w:ilvl="8">
+      <w:startOverride w:val="1"/>
+    </w:lvlOverride>
+  </w:num>
+  <w:num w:numId="1009">
+    <w:abstractNumId w:val="99411"/>
+    <w:lvlOverride w:ilvl="0">
+      <w:startOverride w:val="1"/>
+    </w:lvlOverride>
+    <w:lvlOverride w:ilvl="1">
+      <w:startOverride w:val="1"/>
+    </w:lvlOverride>
+    <w:lvlOverride w:ilvl="2">
+      <w:startOverride w:val="1"/>
+    </w:lvlOverride>
+    <w:lvlOverride w:ilvl="3">
+      <w:startOverride w:val="1"/>
+    </w:lvlOverride>
+    <w:lvlOverride w:ilvl="4">
+      <w:startOverride w:val="1"/>
+    </w:lvlOverride>
+    <w:lvlOverride w:ilvl="5">
+      <w:startOverride w:val="1"/>
+    </w:lvlOverride>
+    <w:lvlOverride w:ilvl="6">
+      <w:startOverride w:val="1"/>
+    </w:lvlOverride>
+    <w:lvlOverride w:ilvl="7">
+      <w:startOverride w:val="1"/>
+    </w:lvlOverride>
+    <w:lvlOverride w:ilvl="8">
+      <w:startOverride w:val="1"/>
+    </w:lvlOverride>
+  </w:num>
+  <w:num w:numId="1010">
+    <w:abstractNumId w:val="991"/>
+  </w:num>
+  <w:num w:numId="1011">
+    <w:abstractNumId w:val="991"/>
+  </w:num>
+  <w:num w:numId="1012">
+    <w:abstractNumId w:val="99411"/>
+    <w:lvlOverride w:ilvl="0">
+      <w:startOverride w:val="1"/>
+    </w:lvlOverride>
+    <w:lvlOverride w:ilvl="1">
+      <w:startOverride w:val="1"/>
+    </w:lvlOverride>
+    <w:lvlOverride w:ilvl="2">
+      <w:startOverride w:val="1"/>
+    </w:lvlOverride>
+    <w:lvlOverride w:ilvl="3">
+      <w:startOverride w:val="1"/>
+    </w:lvlOverride>
+    <w:lvlOverride w:ilvl="4">
+      <w:startOverride w:val="1"/>
+    </w:lvlOverride>
+    <w:lvlOverride w:ilvl="5">
+      <w:startOverride w:val="1"/>
+    </w:lvlOverride>
+    <w:lvlOverride w:ilvl="6">
+      <w:startOverride w:val="1"/>
+    </w:lvlOverride>
+    <w:lvlOverride w:ilvl="7">
+      <w:startOverride w:val="1"/>
+    </w:lvlOverride>
+    <w:lvlOverride w:ilvl="8">
+      <w:startOverride w:val="1"/>
+    </w:lvlOverride>
+  </w:num>
+  <w:num w:numId="1013">
     <w:abstractNumId w:val="991"/>
   </w:num>
 </w:numbering>

</xml_diff>

<commit_message>
Updates to case studies; re-render
</commit_message>
<xml_diff>
--- a/docs/cases/01-dax-cowart.docx
+++ b/docs/cases/01-dax-cowart.docx
@@ -53,7 +53,7 @@
         <w:p>
           <w:r>
             <w:fldChar w:fldCharType="begin" w:dirty="true"/>
-            <w:instrText xml:space="preserve">TOC \o "1-3" \h \z \u</w:instrText>
+            <w:instrText xml:space="preserve">TOC \o "1-2" \h \z \u</w:instrText>
             <w:fldChar w:fldCharType="separate"/>
             <w:fldChar w:fldCharType="end"/>
           </w:r>
@@ -163,6 +163,9 @@
         <w:t xml:space="preserve"> </w:t>
       </w:r>
       <w:r>
+        <w:rPr>
+          <w:rStyle w:val="KeyTerm"/>
+        </w:rPr>
         <w:t xml:space="preserve">autonomy</w:t>
       </w:r>
       <w:r>
@@ -175,6 +178,9 @@
         <w:t xml:space="preserve"> </w:t>
       </w:r>
       <w:r>
+        <w:rPr>
+          <w:rStyle w:val="KeyTerm"/>
+        </w:rPr>
         <w:t xml:space="preserve">beneficence</w:t>
       </w:r>
       <w:r>
@@ -337,7 +343,7 @@
     </w:p>
     <w:p>
       <w:pPr>
-        <w:pStyle w:val="BodyText"/>
+        <w:pStyle w:val="ContextBox"/>
       </w:pPr>
       <w:r>
         <w:rPr>
@@ -421,7 +427,7 @@
     </w:p>
     <w:p>
       <w:pPr>
-        <w:pStyle w:val="FirstParagraph"/>
+        <w:pStyle w:val="ContextBox"/>
       </w:pPr>
       <w:r>
         <w:t xml:space="preserve">The amount burned is reported as percent of</w:t>
@@ -430,6 +436,9 @@
         <w:t xml:space="preserve"> </w:t>
       </w:r>
       <w:r>
+        <w:rPr>
+          <w:rStyle w:val="KeyTerm"/>
+        </w:rPr>
         <w:t xml:space="preserve">total body surface area</w:t>
       </w:r>
       <w:r>
@@ -442,6 +451,9 @@
         <w:t xml:space="preserve"> </w:t>
       </w:r>
       <w:r>
+        <w:rPr>
+          <w:rStyle w:val="KeyTerm"/>
+        </w:rPr>
         <w:t xml:space="preserve">debridement</w:t>
       </w:r>
       <w:r>
@@ -738,7 +750,7 @@
     </w:p>
     <w:p>
       <w:pPr>
-        <w:pStyle w:val="BodyText"/>
+        <w:pStyle w:val="ContextBox"/>
       </w:pPr>
       <w:r>
         <w:rPr>
@@ -751,6 +763,9 @@
         <w:t xml:space="preserve"> </w:t>
       </w:r>
       <w:r>
+        <w:rPr>
+          <w:rStyle w:val="KeyTerm"/>
+        </w:rPr>
         <w:t xml:space="preserve">Decision-making capacity</w:t>
       </w:r>
       <w:r>
@@ -810,7 +825,7 @@
     </w:p>
     <w:p>
       <w:pPr>
-        <w:pStyle w:val="FirstParagraph"/>
+        <w:pStyle w:val="ContextBox"/>
       </w:pPr>
       <w:r>
         <w:t xml:space="preserve">Capacity is</w:t>
@@ -860,6 +875,9 @@
         <w:t xml:space="preserve"> </w:t>
       </w:r>
       <w:r>
+        <w:rPr>
+          <w:rStyle w:val="KeyTerm"/>
+        </w:rPr>
         <w:t xml:space="preserve">surrogate</w:t>
       </w:r>
       <w:r>
@@ -1144,7 +1162,7 @@
     </w:p>
     <w:p>
       <w:pPr>
-        <w:pStyle w:val="FirstParagraph"/>
+        <w:pStyle w:val="ContextBox"/>
       </w:pPr>
       <w:r>
         <w:rPr>
@@ -1157,6 +1175,9 @@
         <w:t xml:space="preserve"> </w:t>
       </w:r>
       <w:r>
+        <w:rPr>
+          <w:rStyle w:val="KeyTerm"/>
+        </w:rPr>
         <w:t xml:space="preserve">Informed consent</w:t>
       </w:r>
       <w:r>
@@ -1214,6 +1235,9 @@
         <w:t xml:space="preserve"> </w:t>
       </w:r>
       <w:r>
+        <w:rPr>
+          <w:rStyle w:val="KeyTerm"/>
+        </w:rPr>
         <w:t xml:space="preserve">informed refusal</w:t>
       </w:r>
       <w:r>
@@ -1242,6 +1266,9 @@
         <w:t xml:space="preserve"> </w:t>
       </w:r>
       <w:r>
+        <w:rPr>
+          <w:rStyle w:val="KeyTerm"/>
+        </w:rPr>
         <w:t xml:space="preserve">paternalistic</w:t>
       </w:r>
       <w:r>
@@ -1314,6 +1341,9 @@
         <w:t xml:space="preserve"> </w:t>
       </w:r>
       <w:r>
+        <w:rPr>
+          <w:rStyle w:val="KeyTerm"/>
+        </w:rPr>
         <w:t xml:space="preserve">utilitarian</w:t>
       </w:r>
       <w:r>
@@ -1452,6 +1482,9 @@
         <w:t xml:space="preserve"> </w:t>
       </w:r>
       <w:r>
+        <w:rPr>
+          <w:rStyle w:val="KeyTerm"/>
+        </w:rPr>
         <w:t xml:space="preserve">moral residue</w:t>
       </w:r>
       <w:r>
@@ -1487,6 +1520,9 @@
         <w:t xml:space="preserve"> </w:t>
       </w:r>
       <w:r>
+        <w:rPr>
+          <w:rStyle w:val="KeyTerm"/>
+        </w:rPr>
         <w:t xml:space="preserve">Kantian</w:t>
       </w:r>
       <w:r>
@@ -1595,6 +1631,9 @@
         <w:t xml:space="preserve"> </w:t>
       </w:r>
       <w:r>
+        <w:rPr>
+          <w:rStyle w:val="KeyTerm"/>
+        </w:rPr>
         <w:t xml:space="preserve">ethics of care</w:t>
       </w:r>
       <w:r>
@@ -1760,6 +1799,9 @@
         <w:t xml:space="preserve"> </w:t>
       </w:r>
       <w:r>
+        <w:rPr>
+          <w:rStyle w:val="KeyTerm"/>
+        </w:rPr>
         <w:t xml:space="preserve">specification</w:t>
       </w:r>
       <w:r>
@@ -1772,6 +1814,9 @@
         <w:t xml:space="preserve"> </w:t>
       </w:r>
       <w:r>
+        <w:rPr>
+          <w:rStyle w:val="KeyTerm"/>
+        </w:rPr>
         <w:t xml:space="preserve">balancing</w:t>
       </w:r>
       <w:r>
@@ -3597,7 +3642,7 @@
 </file>
 
 <file path=word/styles.xml><?xml version="1.0" encoding="utf-8"?>
-<w:styles xmlns:r="http://schemas.openxmlformats.org/officeDocument/2006/relationships" xmlns:w="http://schemas.openxmlformats.org/wordprocessingml/2006/main">
+<w:styles xmlns:w="http://schemas.openxmlformats.org/wordprocessingml/2006/main">
   <w:docDefaults>
     <w:rPrDefault>
       <w:rPr>
@@ -3617,6 +3662,16 @@
   <w:style w:default="1" w:styleId="Normal" w:type="paragraph">
     <w:name w:val="Normal"/>
     <w:qFormat/>
+    <w:rPr>
+      <w:sz w:val="22"/>
+      <w:szCs w:val="22"/>
+      <w:color w:val="1a1a1a"/>
+      <w:rFonts w:ascii="Cambria" w:cs="Cambria" w:hAnsi="Cambria"/>
+    </w:rPr>
+    <w:pPr>
+      <w:spacing w:after="120" w:line="288" w:lineRule="auto"/>
+      <w:jc w:val="both"/>
+    </w:pPr>
   </w:style>
   <w:style w:styleId="BodyText" w:type="paragraph">
     <w:name w:val="Body Text"/>
@@ -3650,14 +3705,18 @@
     <w:qFormat/>
     <w:rsid w:val="00A10FD9"/>
     <w:pPr>
-      <w:spacing w:after="80" w:line="240" w:lineRule="auto"/>
-      <w:contextualSpacing/>
+      <w:spacing w:after="120" w:before="0"/>
       <w:jc w:val="center"/>
+      <w:pBdr>
+        <w:bottom w:color="6b1f2b" w:space="4" w:sz="8" w:val="single"/>
+      </w:pBdr>
     </w:pPr>
     <w:rPr>
-      <w:rFonts w:asciiTheme="majorHAnsi" w:cstheme="majorBidi" w:eastAsiaTheme="majorEastAsia" w:hAnsiTheme="majorHAnsi"/>
-      <w:sz w:val="56"/>
-      <w:szCs w:val="56"/>
+      <w:b/>
+      <w:sz w:val="48"/>
+      <w:szCs w:val="48"/>
+      <w:color w:val="6b1f2b"/>
+      <w:rFonts w:ascii="EB Garamond" w:cs="EB Garamond" w:hAnsi="EB Garamond"/>
     </w:rPr>
   </w:style>
   <w:style w:customStyle="1" w:styleId="TitleChar" w:type="character">
@@ -3681,15 +3740,15 @@
     <w:qFormat/>
     <w:rsid w:val="00A10FD9"/>
     <w:pPr>
-      <w:numPr>
-        <w:ilvl w:val="1"/>
-      </w:numPr>
+      <w:spacing w:after="240" w:before="120"/>
+      <w:jc w:val="center"/>
     </w:pPr>
     <w:rPr>
-      <w:rFonts w:cstheme="majorBidi" w:eastAsiaTheme="majorEastAsia"/>
-      <w:spacing w:val="15"/>
-      <w:sz w:val="28"/>
-      <w:szCs w:val="28"/>
+      <w:i/>
+      <w:sz w:val="26"/>
+      <w:szCs w:val="26"/>
+      <w:color w:val="555555"/>
+      <w:rFonts w:ascii="EB Garamond" w:cs="EB Garamond" w:hAnsi="EB Garamond"/>
     </w:rPr>
   </w:style>
   <w:style w:customStyle="1" w:styleId="SubtitleChar" w:type="character">
@@ -3712,12 +3771,15 @@
     <w:next w:val="BodyText"/>
     <w:qFormat/>
     <w:pPr>
-      <w:keepNext/>
-      <w:keepLines/>
+      <w:spacing w:after="60"/>
+      <w:jc w:val="center"/>
     </w:pPr>
     <w:rPr>
-      <w:sz w:val="24"/>
-      <w:szCs w:val="24"/>
+      <w:smallCaps/>
+      <w:sz w:val="20"/>
+      <w:szCs w:val="20"/>
+      <w:color w:val="555555"/>
+      <w:rFonts w:ascii="EB Garamond" w:cs="EB Garamond" w:hAnsi="EB Garamond"/>
     </w:rPr>
   </w:style>
   <w:style w:styleId="Date" w:type="paragraph">
@@ -3726,12 +3788,15 @@
     <w:next w:val="BodyText"/>
     <w:qFormat/>
     <w:pPr>
-      <w:keepNext/>
-      <w:keepLines/>
+      <w:spacing w:after="60"/>
+      <w:jc w:val="center"/>
     </w:pPr>
     <w:rPr>
-      <w:sz w:val="24"/>
-      <w:szCs w:val="24"/>
+      <w:smallCaps/>
+      <w:sz w:val="20"/>
+      <w:szCs w:val="20"/>
+      <w:color w:val="555555"/>
+      <w:rFonts w:ascii="EB Garamond" w:cs="EB Garamond" w:hAnsi="EB Garamond"/>
     </w:rPr>
   </w:style>
   <w:style w:customStyle="1" w:styleId="AbstractTitle" w:type="paragraph">
@@ -3783,16 +3848,19 @@
     <w:qFormat/>
     <w:rsid w:val="00A10FD9"/>
     <w:pPr>
+      <w:spacing w:after="120" w:before="360"/>
+      <w:pBdr>
+        <w:bottom w:color="6b1f2b" w:space="2" w:sz="4" w:val="single"/>
+      </w:pBdr>
       <w:keepNext/>
-      <w:keepLines/>
-      <w:spacing w:after="80" w:before="360"/>
-      <w:outlineLvl w:val="0"/>
     </w:pPr>
     <w:rPr>
-      <w:rFonts w:asciiTheme="majorHAnsi" w:cstheme="majorBidi" w:eastAsiaTheme="majorEastAsia" w:hAnsiTheme="majorHAnsi"/>
-      <w:color w:themeColor="accent1" w:themeShade="BF" w:val="0F4761"/>
-      <w:sz w:val="40"/>
-      <w:szCs w:val="40"/>
+      <w:b/>
+      <w:smallCaps/>
+      <w:sz w:val="30"/>
+      <w:szCs w:val="30"/>
+      <w:color w:val="6b1f2b"/>
+      <w:rFonts w:ascii="EB Garamond" w:cs="EB Garamond" w:hAnsi="EB Garamond"/>
     </w:rPr>
   </w:style>
   <w:style w:styleId="Heading2" w:type="paragraph">
@@ -3806,16 +3874,16 @@
     <w:qFormat/>
     <w:rsid w:val="00A10FD9"/>
     <w:pPr>
+      <w:spacing w:after="80" w:before="240"/>
       <w:keepNext/>
-      <w:keepLines/>
-      <w:spacing w:after="80" w:before="160"/>
-      <w:outlineLvl w:val="1"/>
     </w:pPr>
     <w:rPr>
-      <w:rFonts w:asciiTheme="majorHAnsi" w:cstheme="majorBidi" w:eastAsiaTheme="majorEastAsia" w:hAnsiTheme="majorHAnsi"/>
-      <w:color w:themeColor="accent1" w:themeShade="BF" w:val="0F4761"/>
-      <w:sz w:val="32"/>
-      <w:szCs w:val="32"/>
+      <w:b/>
+      <w:i/>
+      <w:sz w:val="26"/>
+      <w:szCs w:val="26"/>
+      <w:color w:val="1f4e5f"/>
+      <w:rFonts w:ascii="EB Garamond" w:cs="EB Garamond" w:hAnsi="EB Garamond"/>
     </w:rPr>
   </w:style>
   <w:style w:styleId="Heading3" w:type="paragraph">
@@ -3829,16 +3897,15 @@
     <w:qFormat/>
     <w:rsid w:val="00A10FD9"/>
     <w:pPr>
+      <w:spacing w:after="60" w:before="180"/>
       <w:keepNext/>
-      <w:keepLines/>
-      <w:spacing w:after="80" w:before="160"/>
-      <w:outlineLvl w:val="2"/>
     </w:pPr>
     <w:rPr>
-      <w:rFonts w:cstheme="majorBidi" w:eastAsiaTheme="majorEastAsia"/>
-      <w:color w:themeColor="accent1" w:themeShade="BF" w:val="0F4761"/>
-      <w:sz w:val="28"/>
-      <w:szCs w:val="28"/>
+      <w:b/>
+      <w:sz w:val="22"/>
+      <w:szCs w:val="22"/>
+      <w:color w:val="1a1a1a"/>
+      <w:rFonts w:ascii="EB Garamond" w:cs="EB Garamond" w:hAnsi="EB Garamond"/>
     </w:rPr>
   </w:style>
   <w:style w:styleId="Heading4" w:type="paragraph">
@@ -4100,9 +4167,17 @@
     <w:unhideWhenUsed/>
     <w:qFormat/>
     <w:pPr>
-      <w:spacing w:after="100" w:before="100"/>
-      <w:ind w:firstLine="0" w:left="480" w:right="480"/>
+      <w:spacing w:after="120" w:before="120" w:line="288" w:lineRule="auto"/>
+      <w:ind w:left="720" w:right="720"/>
+      <w:jc w:val="both"/>
     </w:pPr>
+    <w:rPr>
+      <w:i/>
+      <w:sz w:val="22"/>
+      <w:szCs w:val="22"/>
+      <w:color w:val="333333"/>
+      <w:rFonts w:ascii="Cambria" w:cs="Cambria" w:hAnsi="Cambria"/>
+    </w:rPr>
   </w:style>
   <w:style w:styleId="FootnoteText" w:type="paragraph">
     <w:name w:val="Footnote Text"/>
@@ -4175,10 +4250,15 @@
     <w:basedOn w:val="Normal"/>
     <w:link w:val="BodyTextChar"/>
     <w:pPr>
-      <w:spacing w:after="120" w:before="0"/>
+      <w:spacing w:after="180" w:before="60"/>
+      <w:jc w:val="center"/>
     </w:pPr>
     <w:rPr>
       <w:i/>
+      <w:sz w:val="18"/>
+      <w:szCs w:val="18"/>
+      <w:color w:val="555555"/>
+      <w:rFonts w:ascii="Cambria" w:cs="Cambria" w:hAnsi="Cambria"/>
     </w:rPr>
   </w:style>
   <w:style w:customStyle="1" w:styleId="TableCaption" w:type="paragraph">
@@ -4252,232 +4332,358 @@
       <w:color w:themeColor="accent1" w:themeShade="BF" w:val="365F91"/>
     </w:rPr>
   </w:style>
+  <w:style w:styleId="CaseGlance" w:type="paragraph">
+    <w:name w:val="CaseGlance"/>
+    <w:basedOn w:val="Normal"/>
+    <w:next w:val="Normal"/>
+    <w:qFormat/>
+    <w:pPr>
+      <w:spacing w:after="120" w:before="120" w:line="276" w:lineRule="auto"/>
+      <w:ind w:left="200" w:right="200"/>
+      <w:jc w:val="left"/>
+      <w:pBdr>
+        <w:bottom w:color="6b1f2b" w:space="4" w:sz="6" w:val="single"/>
+      </w:pBdr>
+      <w:shd w:color="auto" w:fill="F7F1E3" w:val="clear"/>
+    </w:pPr>
+    <w:rPr>
+      <w:sz w:val="20"/>
+      <w:szCs w:val="20"/>
+      <w:color w:val="1a1a1a"/>
+      <w:rFonts w:ascii="Cambria" w:cs="Cambria" w:hAnsi="Cambria"/>
+    </w:rPr>
+  </w:style>
+  <w:style w:styleId="ContextBox" w:type="paragraph">
+    <w:name w:val="ContextBox"/>
+    <w:basedOn w:val="Normal"/>
+    <w:next w:val="Normal"/>
+    <w:qFormat/>
+    <w:pPr>
+      <w:spacing w:after="120" w:before="120" w:line="276" w:lineRule="auto"/>
+      <w:ind w:left="240" w:right="120"/>
+      <w:jc w:val="left"/>
+      <w:shd w:color="auto" w:fill="EAF2F4" w:val="clear"/>
+    </w:pPr>
+    <w:rPr>
+      <w:sz w:val="20"/>
+      <w:szCs w:val="20"/>
+      <w:color w:val="1a1a1a"/>
+      <w:rFonts w:ascii="Cambria" w:cs="Cambria" w:hAnsi="Cambria"/>
+    </w:rPr>
+  </w:style>
+  <w:style w:styleId="CalloutNote" w:type="paragraph">
+    <w:name w:val="CalloutNote"/>
+    <w:basedOn w:val="Normal"/>
+    <w:next w:val="Normal"/>
+    <w:qFormat/>
+    <w:pPr>
+      <w:spacing w:after="120" w:before="120"/>
+      <w:ind w:left="240"/>
+      <w:shd w:color="auto" w:fill="F5F0EA" w:val="clear"/>
+    </w:pPr>
+    <w:rPr>
+      <w:i/>
+      <w:sz w:val="20"/>
+      <w:szCs w:val="20"/>
+      <w:color w:val="333333"/>
+      <w:rFonts w:ascii="Cambria" w:cs="Cambria" w:hAnsi="Cambria"/>
+    </w:rPr>
+  </w:style>
+  <w:style w:styleId="PullQuote" w:type="paragraph">
+    <w:name w:val="PullQuote"/>
+    <w:basedOn w:val="Normal"/>
+    <w:next w:val="Normal"/>
+    <w:qFormat/>
+    <w:pPr>
+      <w:spacing w:after="180" w:before="180" w:line="312" w:lineRule="auto"/>
+      <w:ind w:left="720" w:right="720"/>
+      <w:jc w:val="center"/>
+    </w:pPr>
+    <w:rPr>
+      <w:i/>
+      <w:sz w:val="28"/>
+      <w:szCs w:val="28"/>
+      <w:color w:val="6b1f2b"/>
+      <w:rFonts w:ascii="EB Garamond" w:cs="EB Garamond" w:hAnsi="EB Garamond"/>
+    </w:rPr>
+  </w:style>
+  <w:style w:styleId="KeyTerm" w:type="character">
+    <w:name w:val="KeyTerm"/>
+    <w:qFormat/>
+    <w:rPr>
+      <w:b/>
+      <w:smallCaps/>
+      <w:color w:val="6b1f2b"/>
+    </w:rPr>
+  </w:style>
   <w:style w:type="paragraph" w:customStyle="1" w:styleId="SourceCode">
     <w:name w:val="Source Code"/>
     <w:basedOn w:val="Normal"/>
     <w:link w:val="VerbatimChar"/>
     <w:pPr>
       <w:wordWrap w:val="off"/>
+      <w:shd w:val="clear" w:fill="f8f8f8"/>
     </w:pPr>
   </w:style>
   <w:style w:type="character" w:customStyle="1" w:styleId="KeywordTok">
     <w:name w:val="KeywordTok"/>
     <w:basedOn w:val="VerbatimChar"/>
     <w:rPr>
-      <w:color w:val="d73a49"/>
+      <w:b/>
+      <w:color w:val="204a87"/>
+      <w:shd w:val="clear" w:fill="f8f8f8"/>
     </w:rPr>
   </w:style>
   <w:style w:type="character" w:customStyle="1" w:styleId="DataTypeTok">
     <w:name w:val="DataTypeTok"/>
     <w:basedOn w:val="VerbatimChar"/>
     <w:rPr>
-      <w:color w:val="d73a49"/>
+      <w:color w:val="204a87"/>
+      <w:shd w:val="clear" w:fill="f8f8f8"/>
     </w:rPr>
   </w:style>
   <w:style w:type="character" w:customStyle="1" w:styleId="DecValTok">
     <w:name w:val="DecValTok"/>
     <w:basedOn w:val="VerbatimChar"/>
     <w:rPr>
-      <w:color w:val="005cc5"/>
+      <w:color w:val="0000cf"/>
+      <w:shd w:val="clear" w:fill="f8f8f8"/>
     </w:rPr>
   </w:style>
   <w:style w:type="character" w:customStyle="1" w:styleId="BaseNTok">
     <w:name w:val="BaseNTok"/>
     <w:basedOn w:val="VerbatimChar"/>
     <w:rPr>
-      <w:color w:val="005cc5"/>
+      <w:color w:val="0000cf"/>
+      <w:shd w:val="clear" w:fill="f8f8f8"/>
     </w:rPr>
   </w:style>
   <w:style w:type="character" w:customStyle="1" w:styleId="FloatTok">
     <w:name w:val="FloatTok"/>
     <w:basedOn w:val="VerbatimChar"/>
     <w:rPr>
-      <w:color w:val="005cc5"/>
+      <w:color w:val="0000cf"/>
+      <w:shd w:val="clear" w:fill="f8f8f8"/>
     </w:rPr>
   </w:style>
   <w:style w:type="character" w:customStyle="1" w:styleId="ConstantTok">
     <w:name w:val="ConstantTok"/>
     <w:basedOn w:val="VerbatimChar"/>
     <w:rPr>
-      <w:color w:val="005cc5"/>
+      <w:color w:val="8f5902"/>
+      <w:shd w:val="clear" w:fill="f8f8f8"/>
     </w:rPr>
   </w:style>
   <w:style w:type="character" w:customStyle="1" w:styleId="CharTok">
     <w:name w:val="CharTok"/>
     <w:basedOn w:val="VerbatimChar"/>
     <w:rPr>
-      <w:color w:val="032f62"/>
+      <w:color w:val="4e9a06"/>
+      <w:shd w:val="clear" w:fill="f8f8f8"/>
     </w:rPr>
   </w:style>
   <w:style w:type="character" w:customStyle="1" w:styleId="SpecialCharTok">
     <w:name w:val="SpecialCharTok"/>
     <w:basedOn w:val="VerbatimChar"/>
     <w:rPr>
-      <w:color w:val="005cc5"/>
+      <w:b/>
+      <w:color w:val="ce5c00"/>
+      <w:shd w:val="clear" w:fill="f8f8f8"/>
     </w:rPr>
   </w:style>
   <w:style w:type="character" w:customStyle="1" w:styleId="StringTok">
     <w:name w:val="StringTok"/>
     <w:basedOn w:val="VerbatimChar"/>
     <w:rPr>
-      <w:color w:val="032f62"/>
+      <w:color w:val="4e9a06"/>
+      <w:shd w:val="clear" w:fill="f8f8f8"/>
     </w:rPr>
   </w:style>
   <w:style w:type="character" w:customStyle="1" w:styleId="VerbatimStringTok">
     <w:name w:val="VerbatimStringTok"/>
     <w:basedOn w:val="VerbatimChar"/>
     <w:rPr>
-      <w:color w:val="032f62"/>
+      <w:color w:val="4e9a06"/>
+      <w:shd w:val="clear" w:fill="f8f8f8"/>
     </w:rPr>
   </w:style>
   <w:style w:type="character" w:customStyle="1" w:styleId="SpecialStringTok">
     <w:name w:val="SpecialStringTok"/>
     <w:basedOn w:val="VerbatimChar"/>
     <w:rPr>
-      <w:color w:val="032f62"/>
+      <w:color w:val="4e9a06"/>
+      <w:shd w:val="clear" w:fill="f8f8f8"/>
     </w:rPr>
   </w:style>
   <w:style w:type="character" w:customStyle="1" w:styleId="ImportTok">
     <w:name w:val="ImportTok"/>
     <w:basedOn w:val="VerbatimChar"/>
     <w:rPr>
-      <w:color w:val="032f62"/>
+      <w:shd w:val="clear" w:fill="f8f8f8"/>
     </w:rPr>
   </w:style>
   <w:style w:type="character" w:customStyle="1" w:styleId="CommentTok">
     <w:name w:val="CommentTok"/>
     <w:basedOn w:val="VerbatimChar"/>
     <w:rPr>
-      <w:color w:val="6a737d"/>
+      <w:i/>
+      <w:color w:val="8f5902"/>
+      <w:shd w:val="clear" w:fill="f8f8f8"/>
     </w:rPr>
   </w:style>
   <w:style w:type="character" w:customStyle="1" w:styleId="DocumentationTok">
     <w:name w:val="DocumentationTok"/>
     <w:basedOn w:val="VerbatimChar"/>
     <w:rPr>
-      <w:color w:val="6a737d"/>
+      <w:b/>
+      <w:i/>
+      <w:color w:val="8f5902"/>
+      <w:shd w:val="clear" w:fill="f8f8f8"/>
     </w:rPr>
   </w:style>
   <w:style w:type="character" w:customStyle="1" w:styleId="AnnotationTok">
     <w:name w:val="AnnotationTok"/>
     <w:basedOn w:val="VerbatimChar"/>
     <w:rPr>
-      <w:color w:val="6a737d"/>
+      <w:b/>
+      <w:i/>
+      <w:color w:val="8f5902"/>
+      <w:shd w:val="clear" w:fill="f8f8f8"/>
     </w:rPr>
   </w:style>
   <w:style w:type="character" w:customStyle="1" w:styleId="CommentVarTok">
     <w:name w:val="CommentVarTok"/>
     <w:basedOn w:val="VerbatimChar"/>
     <w:rPr>
-      <w:color w:val="6a737d"/>
+      <w:b/>
+      <w:i/>
+      <w:color w:val="8f5902"/>
+      <w:shd w:val="clear" w:fill="f8f8f8"/>
     </w:rPr>
   </w:style>
   <w:style w:type="character" w:customStyle="1" w:styleId="OtherTok">
     <w:name w:val="OtherTok"/>
     <w:basedOn w:val="VerbatimChar"/>
     <w:rPr>
-      <w:color w:val="6f42c1"/>
+      <w:color w:val="8f5902"/>
+      <w:shd w:val="clear" w:fill="f8f8f8"/>
     </w:rPr>
   </w:style>
   <w:style w:type="character" w:customStyle="1" w:styleId="FunctionTok">
     <w:name w:val="FunctionTok"/>
     <w:basedOn w:val="VerbatimChar"/>
     <w:rPr>
-      <w:color w:val="6f42c1"/>
+      <w:b/>
+      <w:color w:val="204a87"/>
+      <w:shd w:val="clear" w:fill="f8f8f8"/>
     </w:rPr>
   </w:style>
   <w:style w:type="character" w:customStyle="1" w:styleId="VariableTok">
     <w:name w:val="VariableTok"/>
     <w:basedOn w:val="VerbatimChar"/>
     <w:rPr>
-      <w:color w:val="e36209"/>
+      <w:color w:val="000000"/>
+      <w:shd w:val="clear" w:fill="f8f8f8"/>
     </w:rPr>
   </w:style>
   <w:style w:type="character" w:customStyle="1" w:styleId="ControlFlowTok">
     <w:name w:val="ControlFlowTok"/>
     <w:basedOn w:val="VerbatimChar"/>
     <w:rPr>
-      <w:color w:val="d73a49"/>
+      <w:b/>
+      <w:color w:val="204a87"/>
+      <w:shd w:val="clear" w:fill="f8f8f8"/>
     </w:rPr>
   </w:style>
   <w:style w:type="character" w:customStyle="1" w:styleId="OperatorTok">
     <w:name w:val="OperatorTok"/>
     <w:basedOn w:val="VerbatimChar"/>
     <w:rPr>
-      <w:color w:val="24292e"/>
+      <w:b/>
+      <w:color w:val="ce5c00"/>
+      <w:shd w:val="clear" w:fill="f8f8f8"/>
     </w:rPr>
   </w:style>
   <w:style w:type="character" w:customStyle="1" w:styleId="BuiltInTok">
     <w:name w:val="BuiltInTok"/>
     <w:basedOn w:val="VerbatimChar"/>
     <w:rPr>
-      <w:color w:val="d73a49"/>
+      <w:shd w:val="clear" w:fill="f8f8f8"/>
     </w:rPr>
   </w:style>
   <w:style w:type="character" w:customStyle="1" w:styleId="ExtensionTok">
     <w:name w:val="ExtensionTok"/>
     <w:basedOn w:val="VerbatimChar"/>
     <w:rPr>
-      <w:b/>
-      <w:color w:val="d73a49"/>
+      <w:shd w:val="clear" w:fill="f8f8f8"/>
     </w:rPr>
   </w:style>
   <w:style w:type="character" w:customStyle="1" w:styleId="PreprocessorTok">
     <w:name w:val="PreprocessorTok"/>
     <w:basedOn w:val="VerbatimChar"/>
     <w:rPr>
-      <w:color w:val="d73a49"/>
+      <w:i/>
+      <w:color w:val="8f5902"/>
+      <w:shd w:val="clear" w:fill="f8f8f8"/>
     </w:rPr>
   </w:style>
   <w:style w:type="character" w:customStyle="1" w:styleId="AttributeTok">
     <w:name w:val="AttributeTok"/>
     <w:basedOn w:val="VerbatimChar"/>
     <w:rPr>
-      <w:color w:val="d73a49"/>
+      <w:color w:val="204a87"/>
+      <w:shd w:val="clear" w:fill="f8f8f8"/>
     </w:rPr>
   </w:style>
   <w:style w:type="character" w:customStyle="1" w:styleId="RegionMarkerTok">
     <w:name w:val="RegionMarkerTok"/>
     <w:basedOn w:val="VerbatimChar"/>
     <w:rPr>
-      <w:color w:val="6a737d"/>
+      <w:shd w:val="clear" w:fill="f8f8f8"/>
     </w:rPr>
   </w:style>
   <w:style w:type="character" w:customStyle="1" w:styleId="InformationTok">
     <w:name w:val="InformationTok"/>
     <w:basedOn w:val="VerbatimChar"/>
     <w:rPr>
-      <w:color w:val="6a737d"/>
+      <w:b/>
+      <w:i/>
+      <w:color w:val="8f5902"/>
+      <w:shd w:val="clear" w:fill="f8f8f8"/>
     </w:rPr>
   </w:style>
   <w:style w:type="character" w:customStyle="1" w:styleId="WarningTok">
     <w:name w:val="WarningTok"/>
     <w:basedOn w:val="VerbatimChar"/>
     <w:rPr>
-      <w:color w:val="ff5555"/>
+      <w:b/>
+      <w:i/>
+      <w:color w:val="8f5902"/>
+      <w:shd w:val="clear" w:fill="f8f8f8"/>
     </w:rPr>
   </w:style>
   <w:style w:type="character" w:customStyle="1" w:styleId="AlertTok">
     <w:name w:val="AlertTok"/>
     <w:basedOn w:val="VerbatimChar"/>
     <w:rPr>
-      <w:b/>
-      <w:color w:val="ff5555"/>
+      <w:color w:val="ef2929"/>
+      <w:shd w:val="clear" w:fill="f8f8f8"/>
     </w:rPr>
   </w:style>
   <w:style w:type="character" w:customStyle="1" w:styleId="ErrorTok">
     <w:name w:val="ErrorTok"/>
     <w:basedOn w:val="VerbatimChar"/>
     <w:rPr>
-      <w:color w:val="ff5555"/>
-      <w:u/>
+      <w:b/>
+      <w:color w:val="a40000"/>
+      <w:shd w:val="clear" w:fill="f8f8f8"/>
     </w:rPr>
   </w:style>
   <w:style w:type="character" w:customStyle="1" w:styleId="NormalTok">
     <w:name w:val="NormalTok"/>
     <w:basedOn w:val="VerbatimChar"/>
     <w:rPr>
-      <w:color w:val="24292e"/>
+      <w:shd w:val="clear" w:fill="f8f8f8"/>
     </w:rPr>
   </w:style>
 </w:styles>

</xml_diff>

<commit_message>
Revisions to case studies
</commit_message>
<xml_diff>
--- a/docs/cases/01-dax-cowart.docx
+++ b/docs/cases/01-dax-cowart.docx
@@ -31,7 +31,7 @@
         <w:pStyle w:val="Date"/>
       </w:pPr>
       <w:r>
-        <w:t xml:space="preserve">2026-05-21</w:t>
+        <w:t xml:space="preserve">2026-06-18</w:t>
       </w:r>
     </w:p>
     <w:sdt>
@@ -614,23 +614,7 @@
         <w:pStyle w:val="FirstParagraph"/>
       </w:pPr>
       <w:r>
-        <w:t xml:space="preserve">What makes Cowart’s case central to bioethics is not the horror of the burns. It is the</w:t>
-      </w:r>
-      <w:r>
-        <w:t xml:space="preserve"> </w:t>
-      </w:r>
-      <w:r>
-        <w:rPr>
-          <w:i/>
-          <w:iCs/>
-        </w:rPr>
-        <w:t xml:space="preserve">quality of the disagreement</w:t>
-      </w:r>
-      <w:r>
-        <w:t xml:space="preserve"> </w:t>
-      </w:r>
-      <w:r>
-        <w:t xml:space="preserve">it produced. Over fifty years, Cowart, his physicians, and a series of philosophers and lawyers built an argument, attacked it, repaired it, and attacked the repair. The pieces below trace that exchange as a connected dialogue. Each move answers the one before.</w:t>
+        <w:t xml:space="preserve">Cowart’s case became the test the modern right to refuse treatment had to pass. The principle was already stirring in 1970s bioethics — that patients, not physicians, should rule over their own bodies — but it had not yet met a patient who was fully competent, in agony, and demanding to be allowed to die from injuries he was likely to survive. For fifty years Cowart, his physicians, and a line of philosophers and lawyers fought over the one question his case posed without escape: may a competent person refuse life-saving care precisely because the life saved would be his to live?</w:t>
       </w:r>
     </w:p>
     <w:bookmarkStart w:id="10" w:name="the-argument-from-autonomy"/>
@@ -2256,7 +2240,7 @@
         <w:t xml:space="preserve"> </w:t>
       </w:r>
       <w:r>
-        <w:t xml:space="preserve">Fifty years on, that is roughly where the argument rests — not at an answer, but at a sharper question, with Cowart’s autonomy claim intact and the certainty once used against it gone on both sides.</w:t>
+        <w:t xml:space="preserve">Fifty years on, that is roughly where the argument rests — not at an answer, but at a harder question, with Cowart’s autonomy claim intact and the certainty once used against it gone on both sides.</w:t>
       </w:r>
     </w:p>
     <w:bookmarkEnd w:id="19"/>

</xml_diff>